<commit_message>
feat: apply v7 requirements, add screen 6 and 7
</commit_message>
<xml_diff>
--- a/2_웹앱용_제작가이드.docx
+++ b/2_웹앱용_제작가이드.docx
@@ -18,7 +18,7 @@
           <w:sz w:val="28"/>
           <w:szCs w:val="28"/>
         </w:rPr>
-        <w:t xml:space="preserve">제작 가이드 v5</w:t>
+        <w:t xml:space="preserve">제작 가이드 v7</w:t>
       </w:r>
     </w:p>
     <w:p>
@@ -49,7 +49,7 @@
           <w:sz w:val="24"/>
           <w:szCs w:val="24"/>
         </w:rPr>
-        <w:t xml:space="preserve">부서·직급 로그인 + 역할별 난이도 문항 명세</w:t>
+        <w:t xml:space="preserve">의생활 중심 심화판 — 트릭 문제 + 교과서 반영</w:t>
       </w:r>
     </w:p>
     <w:p>
@@ -75,28 +75,118 @@
         <w:spacing w:after="200" w:before="400"/>
       </w:pPr>
       <w:r>
-        <w:t xml:space="preserve">0. 로그인 구조 — 부서 선택 → 직급 선택</w:t>
+        <w:t xml:space="preserve">v7에서 달라진 점</w:t>
       </w:r>
     </w:p>
     <w:p>
       <w:pPr>
-        <w:spacing w:after="160" w:line="300"/>
+        <w:pStyle w:val="ListParagraph"/>
+        <w:numPr>
+          <w:ilvl w:val="0"/>
+          <w:numId w:val="1"/>
+        </w:numPr>
+        <w:spacing w:after="80" w:line="276"/>
       </w:pPr>
       <w:r>
         <w:rPr>
           <w:sz w:val="21"/>
           <w:szCs w:val="21"/>
         </w:rPr>
-        <w:t xml:space="preserve">학번·이름 입력 없이 두 단계 탭만으로 입장한다.</w:t>
+        <w:t xml:space="preserve">5R 용어 정정: Refuse(거절하기)-Reduce(줄이기)-Reuse(재사용하기)-Recycle(재활용하기)-Rot(썩히기). 교과서 3-2-2차시 원문 기준</w:t>
       </w:r>
     </w:p>
     <w:p>
       <w:pPr>
-        <w:pStyle w:val="Heading2"/>
-        <w:spacing w:after="150" w:before="300"/>
+        <w:pStyle w:val="ListParagraph"/>
+        <w:numPr>
+          <w:ilvl w:val="0"/>
+          <w:numId w:val="1"/>
+        </w:numPr>
+        <w:spacing w:after="80" w:line="276"/>
       </w:pPr>
       <w:r>
-        <w:t xml:space="preserve">0-1. 부서 선택 (= 팀 선택)</w:t>
+        <w:rPr>
+          <w:sz w:val="21"/>
+          <w:szCs w:val="21"/>
+        </w:rPr>
+        <w:t xml:space="preserve">1단계에 진짜 '반전 트릭' 추가: 가는 가로줄무늬가 반복되면 오히려 길어 보이는 착시 효과를 이용한 함정 문제</w:t>
+      </w:r>
+    </w:p>
+    <w:p>
+      <w:pPr>
+        <w:pStyle w:val="ListParagraph"/>
+        <w:numPr>
+          <w:ilvl w:val="0"/>
+          <w:numId w:val="1"/>
+        </w:numPr>
+        <w:spacing w:after="80" w:line="276"/>
+      </w:pPr>
+      <w:r>
+        <w:rPr>
+          <w:sz w:val="21"/>
+          <w:szCs w:val="21"/>
+        </w:rPr>
+        <w:t xml:space="preserve">2단계 퍼스널컬러를 교과서 6가지 공식 기준(햇볕 반응·장신구·머리색·피부기·립스틱·혈관색)으로 교체, 의복 스타일 이미지 7종과 얼굴형별 목둘레선 매칭 추가</w:t>
+      </w:r>
+    </w:p>
+    <w:p>
+      <w:pPr>
+        <w:pStyle w:val="ListParagraph"/>
+        <w:numPr>
+          <w:ilvl w:val="0"/>
+          <w:numId w:val="1"/>
+        </w:numPr>
+        <w:spacing w:after="80" w:line="276"/>
+      </w:pPr>
+      <w:r>
+        <w:rPr>
+          <w:sz w:val="21"/>
+          <w:szCs w:val="21"/>
+        </w:rPr>
+        <w:t xml:space="preserve">3단계에 청약철회기간 트릭(전자상거래 7일 vs 방문판매 14일)을 '양념'으로 추가 — 별도 방이 아니라 기존 TPO+마련계획실 안에 통합</w:t>
+      </w:r>
+    </w:p>
+    <w:p>
+      <w:pPr>
+        <w:pStyle w:val="ListParagraph"/>
+        <w:numPr>
+          <w:ilvl w:val="0"/>
+          <w:numId w:val="1"/>
+        </w:numPr>
+        <w:spacing w:after="80" w:line="276"/>
+      </w:pPr>
+      <w:r>
+        <w:rPr>
+          <w:sz w:val="21"/>
+          <w:szCs w:val="21"/>
+        </w:rPr>
+        <w:t xml:space="preserve">의생활(디자인요소·자기표현)이 중심, 지속가능성과 소비자 개념은 마련계획 단계에 곁들이는 구조로 비중 조정</w:t>
+      </w:r>
+    </w:p>
+    <w:p>
+      <w:pPr>
+        <w:pStyle w:val="ListParagraph"/>
+        <w:numPr>
+          <w:ilvl w:val="0"/>
+          <w:numId w:val="1"/>
+        </w:numPr>
+        <w:spacing w:after="80" w:line="276"/>
+      </w:pPr>
+      <w:r>
+        <w:rPr>
+          <w:sz w:val="21"/>
+          <w:szCs w:val="21"/>
+        </w:rPr>
+        <w:t xml:space="preserve">모든 문항은 업로드된 교과서 PPT(2-3-1, 2-3-2, 3-1-1, 3-1-2, 3-2-1, 3-2-2) 원문 내용만 사용</w:t>
+      </w:r>
+    </w:p>
+    <w:p>
+      <w:pPr>
+        <w:pStyle w:val="Heading1"/>
+        <w:spacing w:after="200" w:before="400"/>
+      </w:pPr>
+      <w:r>
+        <w:t xml:space="preserve">1. 관련 성취기준 (심화)</w:t>
       </w:r>
     </w:p>
     <w:tbl>
@@ -112,13 +202,13 @@
         </w:tblBorders>
       </w:tblPr>
       <w:tblGrid>
-        <w:gridCol w:w="2000"/>
-        <w:gridCol w:w="7026"/>
+        <w:gridCol w:w="1500"/>
+        <w:gridCol w:w="7526"/>
       </w:tblGrid>
       <w:tr>
         <w:tc>
           <w:tcPr>
-            <w:tcW w:type="dxa" w:w="2000"/>
+            <w:tcW w:type="dxa" w:w="1500"/>
             <w:shd w:fill="D9E2D0" w:val="clear"/>
             <w:tcMar>
               <w:top w:type="dxa" w:w="100"/>
@@ -139,13 +229,13 @@
                 <w:sz w:val="20"/>
                 <w:szCs w:val="20"/>
               </w:rPr>
-              <w:t xml:space="preserve">부서명</w:t>
-            </w:r>
-          </w:p>
-        </w:tc>
-        <w:tc>
-          <w:tcPr>
-            <w:tcW w:type="dxa" w:w="7026"/>
+              <w:t xml:space="preserve">코드</w:t>
+            </w:r>
+          </w:p>
+        </w:tc>
+        <w:tc>
+          <w:tcPr>
+            <w:tcW w:type="dxa" w:w="7526"/>
             <w:shd w:fill="D9E2D0" w:val="clear"/>
             <w:tcMar>
               <w:top w:type="dxa" w:w="100"/>
@@ -166,7 +256,7 @@
                 <w:sz w:val="20"/>
                 <w:szCs w:val="20"/>
               </w:rPr>
-              <w:t xml:space="preserve">비고</w:t>
+              <w:t xml:space="preserve">성취기준</w:t>
             </w:r>
           </w:p>
         </w:tc>
@@ -174,53 +264,53 @@
       <w:tr>
         <w:tc>
           <w:tcPr>
-            <w:tcW w:type="dxa" w:w="2000"/>
-            <w:tcMar>
-              <w:top w:type="dxa" w:w="100"/>
-              <w:left w:type="dxa" w:w="120"/>
-              <w:bottom w:type="dxa" w:w="100"/>
-              <w:right w:type="dxa" w:w="120"/>
-            </w:tcMar>
-            <w:vAlign w:val="center"/>
-          </w:tcPr>
-          <w:p>
-            <w:pPr>
-              <w:jc w:val="left"/>
-            </w:pPr>
-            <w:r>
-              <w:rPr>
-                <w:b w:val="false"/>
-                <w:bCs w:val="false"/>
-                <w:sz w:val="20"/>
-                <w:szCs w:val="20"/>
-              </w:rPr>
-              <w:t xml:space="preserve">디자인기획부</w:t>
-            </w:r>
-          </w:p>
-        </w:tc>
-        <w:tc>
-          <w:tcPr>
-            <w:tcW w:type="dxa" w:w="7026"/>
-            <w:tcMar>
-              <w:top w:type="dxa" w:w="100"/>
-              <w:left w:type="dxa" w:w="120"/>
-              <w:bottom w:type="dxa" w:w="100"/>
-              <w:right w:type="dxa" w:w="120"/>
-            </w:tcMar>
-            <w:vAlign w:val="center"/>
-          </w:tcPr>
-          <w:p>
-            <w:pPr>
-              <w:jc w:val="left"/>
-            </w:pPr>
-            <w:r>
-              <w:rPr>
-                <w:b w:val="false"/>
-                <w:bCs w:val="false"/>
-                <w:sz w:val="20"/>
-                <w:szCs w:val="20"/>
-              </w:rPr>
-              <w:t xml:space="preserve"/>
+            <w:tcW w:type="dxa" w:w="1500"/>
+            <w:tcMar>
+              <w:top w:type="dxa" w:w="100"/>
+              <w:left w:type="dxa" w:w="120"/>
+              <w:bottom w:type="dxa" w:w="100"/>
+              <w:right w:type="dxa" w:w="120"/>
+            </w:tcMar>
+            <w:vAlign w:val="center"/>
+          </w:tcPr>
+          <w:p>
+            <w:pPr>
+              <w:jc w:val="left"/>
+            </w:pPr>
+            <w:r>
+              <w:rPr>
+                <w:b w:val="false"/>
+                <w:bCs w:val="false"/>
+                <w:sz w:val="20"/>
+                <w:szCs w:val="20"/>
+              </w:rPr>
+              <w:t xml:space="preserve">9기가01-04</w:t>
+            </w:r>
+          </w:p>
+        </w:tc>
+        <w:tc>
+          <w:tcPr>
+            <w:tcW w:type="dxa" w:w="7526"/>
+            <w:tcMar>
+              <w:top w:type="dxa" w:w="100"/>
+              <w:left w:type="dxa" w:w="120"/>
+              <w:bottom w:type="dxa" w:w="100"/>
+              <w:right w:type="dxa" w:w="120"/>
+            </w:tcMar>
+            <w:vAlign w:val="center"/>
+          </w:tcPr>
+          <w:p>
+            <w:pPr>
+              <w:jc w:val="left"/>
+            </w:pPr>
+            <w:r>
+              <w:rPr>
+                <w:b w:val="false"/>
+                <w:bCs w:val="false"/>
+                <w:sz w:val="20"/>
+                <w:szCs w:val="20"/>
+              </w:rPr>
+              <w:t xml:space="preserve">의복디자인 요소를 고려한 자기이미지에 맞는 옷차림으로 자신을 긍정적으로 표현한다.</w:t>
             </w:r>
           </w:p>
         </w:tc>
@@ -228,7 +318,7 @@
       <w:tr>
         <w:tc>
           <w:tcPr>
-            <w:tcW w:type="dxa" w:w="2000"/>
+            <w:tcW w:type="dxa" w:w="1500"/>
             <w:shd w:fill="F5F7F3" w:val="clear"/>
             <w:tcMar>
               <w:top w:type="dxa" w:w="100"/>
@@ -249,13 +339,13 @@
                 <w:sz w:val="20"/>
                 <w:szCs w:val="20"/>
               </w:rPr>
-              <w:t xml:space="preserve">소재개발부</w:t>
-            </w:r>
-          </w:p>
-        </w:tc>
-        <w:tc>
-          <w:tcPr>
-            <w:tcW w:type="dxa" w:w="7026"/>
+              <w:t xml:space="preserve">9기가02-01</w:t>
+            </w:r>
+          </w:p>
+        </w:tc>
+        <w:tc>
+          <w:tcPr>
+            <w:tcW w:type="dxa" w:w="7526"/>
             <w:shd w:fill="F5F7F3" w:val="clear"/>
             <w:tcMar>
               <w:top w:type="dxa" w:w="100"/>
@@ -276,7 +366,7 @@
                 <w:sz w:val="20"/>
                 <w:szCs w:val="20"/>
               </w:rPr>
-              <w:t xml:space="preserve"/>
+              <w:t xml:space="preserve">생활자원의 종류와 특성 및 순환과정을 이해하고, 의식주 자원관리의 중요성을 인식한다.</w:t>
             </w:r>
           </w:p>
         </w:tc>
@@ -284,53 +374,53 @@
       <w:tr>
         <w:tc>
           <w:tcPr>
-            <w:tcW w:type="dxa" w:w="2000"/>
-            <w:tcMar>
-              <w:top w:type="dxa" w:w="100"/>
-              <w:left w:type="dxa" w:w="120"/>
-              <w:bottom w:type="dxa" w:w="100"/>
-              <w:right w:type="dxa" w:w="120"/>
-            </w:tcMar>
-            <w:vAlign w:val="center"/>
-          </w:tcPr>
-          <w:p>
-            <w:pPr>
-              <w:jc w:val="left"/>
-            </w:pPr>
-            <w:r>
-              <w:rPr>
-                <w:b w:val="false"/>
-                <w:bCs w:val="false"/>
-                <w:sz w:val="20"/>
-                <w:szCs w:val="20"/>
-              </w:rPr>
-              <w:t xml:space="preserve">스타일링부</w:t>
-            </w:r>
-          </w:p>
-        </w:tc>
-        <w:tc>
-          <w:tcPr>
-            <w:tcW w:type="dxa" w:w="7026"/>
-            <w:tcMar>
-              <w:top w:type="dxa" w:w="100"/>
-              <w:left w:type="dxa" w:w="120"/>
-              <w:bottom w:type="dxa" w:w="100"/>
-              <w:right w:type="dxa" w:w="120"/>
-            </w:tcMar>
-            <w:vAlign w:val="center"/>
-          </w:tcPr>
-          <w:p>
-            <w:pPr>
-              <w:jc w:val="left"/>
-            </w:pPr>
-            <w:r>
-              <w:rPr>
-                <w:b w:val="false"/>
-                <w:bCs w:val="false"/>
-                <w:sz w:val="20"/>
-                <w:szCs w:val="20"/>
-              </w:rPr>
-              <w:t xml:space="preserve"/>
+            <w:tcW w:type="dxa" w:w="1500"/>
+            <w:tcMar>
+              <w:top w:type="dxa" w:w="100"/>
+              <w:left w:type="dxa" w:w="120"/>
+              <w:bottom w:type="dxa" w:w="100"/>
+              <w:right w:type="dxa" w:w="120"/>
+            </w:tcMar>
+            <w:vAlign w:val="center"/>
+          </w:tcPr>
+          <w:p>
+            <w:pPr>
+              <w:jc w:val="left"/>
+            </w:pPr>
+            <w:r>
+              <w:rPr>
+                <w:b w:val="false"/>
+                <w:bCs w:val="false"/>
+                <w:sz w:val="20"/>
+                <w:szCs w:val="20"/>
+              </w:rPr>
+              <w:t xml:space="preserve">9기가02-05</w:t>
+            </w:r>
+          </w:p>
+        </w:tc>
+        <w:tc>
+          <w:tcPr>
+            <w:tcW w:type="dxa" w:w="7526"/>
+            <w:tcMar>
+              <w:top w:type="dxa" w:w="100"/>
+              <w:left w:type="dxa" w:w="120"/>
+              <w:bottom w:type="dxa" w:w="100"/>
+              <w:right w:type="dxa" w:w="120"/>
+            </w:tcMar>
+            <w:vAlign w:val="center"/>
+          </w:tcPr>
+          <w:p>
+            <w:pPr>
+              <w:jc w:val="left"/>
+            </w:pPr>
+            <w:r>
+              <w:rPr>
+                <w:b w:val="false"/>
+                <w:bCs w:val="false"/>
+                <w:sz w:val="20"/>
+                <w:szCs w:val="20"/>
+              </w:rPr>
+              <w:t xml:space="preserve">의복 재료의 특성을 이해하고 건강과 환경을 고려한 의복의 세탁과 관리 방안을 탐색하여 실천한다.</w:t>
             </w:r>
           </w:p>
         </w:tc>
@@ -338,7 +428,7 @@
       <w:tr>
         <w:tc>
           <w:tcPr>
-            <w:tcW w:type="dxa" w:w="2000"/>
+            <w:tcW w:type="dxa" w:w="1500"/>
             <w:shd w:fill="F5F7F3" w:val="clear"/>
             <w:tcMar>
               <w:top w:type="dxa" w:w="100"/>
@@ -359,13 +449,13 @@
                 <w:sz w:val="20"/>
                 <w:szCs w:val="20"/>
               </w:rPr>
-              <w:t xml:space="preserve">생산전략부</w:t>
-            </w:r>
-          </w:p>
-        </w:tc>
-        <w:tc>
-          <w:tcPr>
-            <w:tcW w:type="dxa" w:w="7026"/>
+              <w:t xml:space="preserve">9기가02-06</w:t>
+            </w:r>
+          </w:p>
+        </w:tc>
+        <w:tc>
+          <w:tcPr>
+            <w:tcW w:type="dxa" w:w="7526"/>
             <w:shd w:fill="F5F7F3" w:val="clear"/>
             <w:tcMar>
               <w:top w:type="dxa" w:w="100"/>
@@ -386,7 +476,7 @@
                 <w:sz w:val="20"/>
                 <w:szCs w:val="20"/>
               </w:rPr>
-              <w:t xml:space="preserve"/>
+              <w:t xml:space="preserve">지속가능성을 고려하여 의복 마련 계획을 세우고, 이를 창의적이고 친환경적인 의생활에 적용한다.</w:t>
             </w:r>
           </w:p>
         </w:tc>
@@ -394,53 +484,53 @@
       <w:tr>
         <w:tc>
           <w:tcPr>
-            <w:tcW w:type="dxa" w:w="2000"/>
-            <w:tcMar>
-              <w:top w:type="dxa" w:w="100"/>
-              <w:left w:type="dxa" w:w="120"/>
-              <w:bottom w:type="dxa" w:w="100"/>
-              <w:right w:type="dxa" w:w="120"/>
-            </w:tcMar>
-            <w:vAlign w:val="center"/>
-          </w:tcPr>
-          <w:p>
-            <w:pPr>
-              <w:jc w:val="left"/>
-            </w:pPr>
-            <w:r>
-              <w:rPr>
-                <w:b w:val="false"/>
-                <w:bCs w:val="false"/>
-                <w:sz w:val="20"/>
-                <w:szCs w:val="20"/>
-              </w:rPr>
-              <w:t xml:space="preserve">마케팅부</w:t>
-            </w:r>
-          </w:p>
-        </w:tc>
-        <w:tc>
-          <w:tcPr>
-            <w:tcW w:type="dxa" w:w="7026"/>
-            <w:tcMar>
-              <w:top w:type="dxa" w:w="100"/>
-              <w:left w:type="dxa" w:w="120"/>
-              <w:bottom w:type="dxa" w:w="100"/>
-              <w:right w:type="dxa" w:w="120"/>
-            </w:tcMar>
-            <w:vAlign w:val="center"/>
-          </w:tcPr>
-          <w:p>
-            <w:pPr>
-              <w:jc w:val="left"/>
-            </w:pPr>
-            <w:r>
-              <w:rPr>
-                <w:b w:val="false"/>
-                <w:bCs w:val="false"/>
-                <w:sz w:val="20"/>
-                <w:szCs w:val="20"/>
-              </w:rPr>
-              <w:t xml:space="preserve"/>
+            <w:tcW w:type="dxa" w:w="1500"/>
+            <w:tcMar>
+              <w:top w:type="dxa" w:w="100"/>
+              <w:left w:type="dxa" w:w="120"/>
+              <w:bottom w:type="dxa" w:w="100"/>
+              <w:right w:type="dxa" w:w="120"/>
+            </w:tcMar>
+            <w:vAlign w:val="center"/>
+          </w:tcPr>
+          <w:p>
+            <w:pPr>
+              <w:jc w:val="left"/>
+            </w:pPr>
+            <w:r>
+              <w:rPr>
+                <w:b w:val="false"/>
+                <w:bCs w:val="false"/>
+                <w:sz w:val="20"/>
+                <w:szCs w:val="20"/>
+              </w:rPr>
+              <w:t xml:space="preserve">9기가02-10</w:t>
+            </w:r>
+          </w:p>
+        </w:tc>
+        <w:tc>
+          <w:tcPr>
+            <w:tcW w:type="dxa" w:w="7526"/>
+            <w:tcMar>
+              <w:top w:type="dxa" w:w="100"/>
+              <w:left w:type="dxa" w:w="120"/>
+              <w:bottom w:type="dxa" w:w="100"/>
+              <w:right w:type="dxa" w:w="120"/>
+            </w:tcMar>
+            <w:vAlign w:val="center"/>
+          </w:tcPr>
+          <w:p>
+            <w:pPr>
+              <w:jc w:val="left"/>
+            </w:pPr>
+            <w:r>
+              <w:rPr>
+                <w:b w:val="false"/>
+                <w:bCs w:val="false"/>
+                <w:sz w:val="20"/>
+                <w:szCs w:val="20"/>
+              </w:rPr>
+              <w:t xml:space="preserve">의식주 생활자원의 생산과 폐기과정을 탐색하고, 일상생활에서 의식주 생활자원을 선택한 과정과 그 결과를 성찰한다.</w:t>
             </w:r>
           </w:p>
         </w:tc>
@@ -448,7 +538,7 @@
       <w:tr>
         <w:tc>
           <w:tcPr>
-            <w:tcW w:type="dxa" w:w="2000"/>
+            <w:tcW w:type="dxa" w:w="1500"/>
             <w:shd w:fill="F5F7F3" w:val="clear"/>
             <w:tcMar>
               <w:top w:type="dxa" w:w="100"/>
@@ -469,13 +559,13 @@
                 <w:sz w:val="20"/>
                 <w:szCs w:val="20"/>
               </w:rPr>
-              <w:t xml:space="preserve">품질관리부</w:t>
-            </w:r>
-          </w:p>
-        </w:tc>
-        <w:tc>
-          <w:tcPr>
-            <w:tcW w:type="dxa" w:w="7026"/>
+              <w:t xml:space="preserve">9기가02-13 (양념)</w:t>
+            </w:r>
+          </w:p>
+        </w:tc>
+        <w:tc>
+          <w:tcPr>
+            <w:tcW w:type="dxa" w:w="7526"/>
             <w:shd w:fill="F5F7F3" w:val="clear"/>
             <w:tcMar>
               <w:top w:type="dxa" w:w="100"/>
@@ -496,455 +586,7 @@
                 <w:sz w:val="20"/>
                 <w:szCs w:val="20"/>
               </w:rPr>
-              <w:t xml:space="preserve">학급 팀 수에 맞춰 6개 중 사용, 팀 수가 다르면 가감</w:t>
-            </w:r>
-          </w:p>
-        </w:tc>
-      </w:tr>
-    </w:tbl>
-    <w:p>
-      <w:pPr>
-        <w:pStyle w:val="Heading2"/>
-        <w:spacing w:after="150" w:before="300"/>
-      </w:pPr>
-      <w:r>
-        <w:t xml:space="preserve">0-2. 직급 선택 (= 개인 역할, 4인)</w:t>
-      </w:r>
-    </w:p>
-    <w:p>
-      <w:pPr>
-        <w:spacing w:after="160" w:line="300"/>
-      </w:pPr>
-      <w:r>
-        <w:rPr>
-          <w:sz w:val="21"/>
-          <w:szCs w:val="21"/>
-        </w:rPr>
-        <w:t xml:space="preserve">부서를 선택하면 그 부서 안에서 팀원 각자 자신의 직급을 탭한다. 이미 다른 팀원이 고른 직급은 비활성화되어 중복 선택이 불가하다.</w:t>
-      </w:r>
-    </w:p>
-    <w:tbl>
-      <w:tblPr>
-        <w:tblW w:type="dxa" w:w="9026"/>
-        <w:tblBorders>
-          <w:top w:val="single" w:color="auto" w:sz="4"/>
-          <w:left w:val="single" w:color="auto" w:sz="4"/>
-          <w:bottom w:val="single" w:color="auto" w:sz="4"/>
-          <w:right w:val="single" w:color="auto" w:sz="4"/>
-          <w:insideH w:val="single" w:color="auto" w:sz="4"/>
-          <w:insideV w:val="single" w:color="auto" w:sz="4"/>
-        </w:tblBorders>
-      </w:tblPr>
-      <w:tblGrid>
-        <w:gridCol w:w="1800"/>
-        <w:gridCol w:w="2200"/>
-        <w:gridCol w:w="5026"/>
-      </w:tblGrid>
-      <w:tr>
-        <w:tc>
-          <w:tcPr>
-            <w:tcW w:type="dxa" w:w="1800"/>
-            <w:shd w:fill="D9E2D0" w:val="clear"/>
-            <w:tcMar>
-              <w:top w:type="dxa" w:w="100"/>
-              <w:left w:type="dxa" w:w="120"/>
-              <w:bottom w:type="dxa" w:w="100"/>
-              <w:right w:type="dxa" w:w="120"/>
-            </w:tcMar>
-            <w:vAlign w:val="center"/>
-          </w:tcPr>
-          <w:p>
-            <w:pPr>
-              <w:jc w:val="left"/>
-            </w:pPr>
-            <w:r>
-              <w:rPr>
-                <w:b/>
-                <w:bCs/>
-                <w:sz w:val="20"/>
-                <w:szCs w:val="20"/>
-              </w:rPr>
-              <w:t xml:space="preserve">직급</w:t>
-            </w:r>
-          </w:p>
-        </w:tc>
-        <w:tc>
-          <w:tcPr>
-            <w:tcW w:type="dxa" w:w="2200"/>
-            <w:shd w:fill="D9E2D0" w:val="clear"/>
-            <w:tcMar>
-              <w:top w:type="dxa" w:w="100"/>
-              <w:left w:type="dxa" w:w="120"/>
-              <w:bottom w:type="dxa" w:w="100"/>
-              <w:right w:type="dxa" w:w="120"/>
-            </w:tcMar>
-            <w:vAlign w:val="center"/>
-          </w:tcPr>
-          <w:p>
-            <w:pPr>
-              <w:jc w:val="left"/>
-            </w:pPr>
-            <w:r>
-              <w:rPr>
-                <w:b/>
-                <w:bCs/>
-                <w:sz w:val="20"/>
-                <w:szCs w:val="20"/>
-              </w:rPr>
-              <w:t xml:space="preserve">난이도</w:t>
-            </w:r>
-          </w:p>
-        </w:tc>
-        <w:tc>
-          <w:tcPr>
-            <w:tcW w:type="dxa" w:w="5026"/>
-            <w:shd w:fill="D9E2D0" w:val="clear"/>
-            <w:tcMar>
-              <w:top w:type="dxa" w:w="100"/>
-              <w:left w:type="dxa" w:w="120"/>
-              <w:bottom w:type="dxa" w:w="100"/>
-              <w:right w:type="dxa" w:w="120"/>
-            </w:tcMar>
-            <w:vAlign w:val="center"/>
-          </w:tcPr>
-          <w:p>
-            <w:pPr>
-              <w:jc w:val="left"/>
-            </w:pPr>
-            <w:r>
-              <w:rPr>
-                <w:b/>
-                <w:bCs/>
-                <w:sz w:val="20"/>
-                <w:szCs w:val="20"/>
-              </w:rPr>
-              <w:t xml:space="preserve">역할 성격</w:t>
-            </w:r>
-          </w:p>
-        </w:tc>
-      </w:tr>
-      <w:tr>
-        <w:tc>
-          <w:tcPr>
-            <w:tcW w:type="dxa" w:w="1800"/>
-            <w:tcMar>
-              <w:top w:type="dxa" w:w="100"/>
-              <w:left w:type="dxa" w:w="120"/>
-              <w:bottom w:type="dxa" w:w="100"/>
-              <w:right w:type="dxa" w:w="120"/>
-            </w:tcMar>
-            <w:vAlign w:val="center"/>
-          </w:tcPr>
-          <w:p>
-            <w:pPr>
-              <w:jc w:val="left"/>
-            </w:pPr>
-            <w:r>
-              <w:rPr>
-                <w:b w:val="false"/>
-                <w:bCs w:val="false"/>
-                <w:sz w:val="20"/>
-                <w:szCs w:val="20"/>
-              </w:rPr>
-              <w:t xml:space="preserve">인턴</w:t>
-            </w:r>
-          </w:p>
-        </w:tc>
-        <w:tc>
-          <w:tcPr>
-            <w:tcW w:type="dxa" w:w="2200"/>
-            <w:tcMar>
-              <w:top w:type="dxa" w:w="100"/>
-              <w:left w:type="dxa" w:w="120"/>
-              <w:bottom w:type="dxa" w:w="100"/>
-              <w:right w:type="dxa" w:w="120"/>
-            </w:tcMar>
-            <w:vAlign w:val="center"/>
-          </w:tcPr>
-          <w:p>
-            <w:pPr>
-              <w:jc w:val="left"/>
-            </w:pPr>
-            <w:r>
-              <w:rPr>
-                <w:b w:val="false"/>
-                <w:bCs w:val="false"/>
-                <w:sz w:val="20"/>
-                <w:szCs w:val="20"/>
-              </w:rPr>
-              <w:t xml:space="preserve">쉬움</w:t>
-            </w:r>
-          </w:p>
-        </w:tc>
-        <w:tc>
-          <w:tcPr>
-            <w:tcW w:type="dxa" w:w="5026"/>
-            <w:tcMar>
-              <w:top w:type="dxa" w:w="100"/>
-              <w:left w:type="dxa" w:w="120"/>
-              <w:bottom w:type="dxa" w:w="100"/>
-              <w:right w:type="dxa" w:w="120"/>
-            </w:tcMar>
-            <w:vAlign w:val="center"/>
-          </w:tcPr>
-          <w:p>
-            <w:pPr>
-              <w:jc w:val="left"/>
-            </w:pPr>
-            <w:r>
-              <w:rPr>
-                <w:b w:val="false"/>
-                <w:bCs w:val="false"/>
-                <w:sz w:val="20"/>
-                <w:szCs w:val="20"/>
-              </w:rPr>
-              <w:t xml:space="preserve">가장 직접적인 단서를 받는다. 문장을 그대로 읽으면 답이 보이는 수준</w:t>
-            </w:r>
-          </w:p>
-        </w:tc>
-      </w:tr>
-      <w:tr>
-        <w:tc>
-          <w:tcPr>
-            <w:tcW w:type="dxa" w:w="1800"/>
-            <w:shd w:fill="F5F7F3" w:val="clear"/>
-            <w:tcMar>
-              <w:top w:type="dxa" w:w="100"/>
-              <w:left w:type="dxa" w:w="120"/>
-              <w:bottom w:type="dxa" w:w="100"/>
-              <w:right w:type="dxa" w:w="120"/>
-            </w:tcMar>
-            <w:vAlign w:val="center"/>
-          </w:tcPr>
-          <w:p>
-            <w:pPr>
-              <w:jc w:val="left"/>
-            </w:pPr>
-            <w:r>
-              <w:rPr>
-                <w:b w:val="false"/>
-                <w:bCs w:val="false"/>
-                <w:sz w:val="20"/>
-                <w:szCs w:val="20"/>
-              </w:rPr>
-              <w:t xml:space="preserve">사원</w:t>
-            </w:r>
-          </w:p>
-        </w:tc>
-        <w:tc>
-          <w:tcPr>
-            <w:tcW w:type="dxa" w:w="2200"/>
-            <w:shd w:fill="F5F7F3" w:val="clear"/>
-            <w:tcMar>
-              <w:top w:type="dxa" w:w="100"/>
-              <w:left w:type="dxa" w:w="120"/>
-              <w:bottom w:type="dxa" w:w="100"/>
-              <w:right w:type="dxa" w:w="120"/>
-            </w:tcMar>
-            <w:vAlign w:val="center"/>
-          </w:tcPr>
-          <w:p>
-            <w:pPr>
-              <w:jc w:val="left"/>
-            </w:pPr>
-            <w:r>
-              <w:rPr>
-                <w:b w:val="false"/>
-                <w:bCs w:val="false"/>
-                <w:sz w:val="20"/>
-                <w:szCs w:val="20"/>
-              </w:rPr>
-              <w:t xml:space="preserve">보통</w:t>
-            </w:r>
-          </w:p>
-        </w:tc>
-        <w:tc>
-          <w:tcPr>
-            <w:tcW w:type="dxa" w:w="5026"/>
-            <w:shd w:fill="F5F7F3" w:val="clear"/>
-            <w:tcMar>
-              <w:top w:type="dxa" w:w="100"/>
-              <w:left w:type="dxa" w:w="120"/>
-              <w:bottom w:type="dxa" w:w="100"/>
-              <w:right w:type="dxa" w:w="120"/>
-            </w:tcMar>
-            <w:vAlign w:val="center"/>
-          </w:tcPr>
-          <w:p>
-            <w:pPr>
-              <w:jc w:val="left"/>
-            </w:pPr>
-            <w:r>
-              <w:rPr>
-                <w:b w:val="false"/>
-                <w:bCs w:val="false"/>
-                <w:sz w:val="20"/>
-                <w:szCs w:val="20"/>
-              </w:rPr>
-              <w:t xml:space="preserve">약간의 해석이 필요한 단서를 받는다</w:t>
-            </w:r>
-          </w:p>
-        </w:tc>
-      </w:tr>
-      <w:tr>
-        <w:tc>
-          <w:tcPr>
-            <w:tcW w:type="dxa" w:w="1800"/>
-            <w:tcMar>
-              <w:top w:type="dxa" w:w="100"/>
-              <w:left w:type="dxa" w:w="120"/>
-              <w:bottom w:type="dxa" w:w="100"/>
-              <w:right w:type="dxa" w:w="120"/>
-            </w:tcMar>
-            <w:vAlign w:val="center"/>
-          </w:tcPr>
-          <w:p>
-            <w:pPr>
-              <w:jc w:val="left"/>
-            </w:pPr>
-            <w:r>
-              <w:rPr>
-                <w:b w:val="false"/>
-                <w:bCs w:val="false"/>
-                <w:sz w:val="20"/>
-                <w:szCs w:val="20"/>
-              </w:rPr>
-              <w:t xml:space="preserve">차장</w:t>
-            </w:r>
-          </w:p>
-        </w:tc>
-        <w:tc>
-          <w:tcPr>
-            <w:tcW w:type="dxa" w:w="2200"/>
-            <w:tcMar>
-              <w:top w:type="dxa" w:w="100"/>
-              <w:left w:type="dxa" w:w="120"/>
-              <w:bottom w:type="dxa" w:w="100"/>
-              <w:right w:type="dxa" w:w="120"/>
-            </w:tcMar>
-            <w:vAlign w:val="center"/>
-          </w:tcPr>
-          <w:p>
-            <w:pPr>
-              <w:jc w:val="left"/>
-            </w:pPr>
-            <w:r>
-              <w:rPr>
-                <w:b w:val="false"/>
-                <w:bCs w:val="false"/>
-                <w:sz w:val="20"/>
-                <w:szCs w:val="20"/>
-              </w:rPr>
-              <w:t xml:space="preserve">약간 어려움</w:t>
-            </w:r>
-          </w:p>
-        </w:tc>
-        <w:tc>
-          <w:tcPr>
-            <w:tcW w:type="dxa" w:w="5026"/>
-            <w:tcMar>
-              <w:top w:type="dxa" w:w="100"/>
-              <w:left w:type="dxa" w:w="120"/>
-              <w:bottom w:type="dxa" w:w="100"/>
-              <w:right w:type="dxa" w:w="120"/>
-            </w:tcMar>
-            <w:vAlign w:val="center"/>
-          </w:tcPr>
-          <w:p>
-            <w:pPr>
-              <w:jc w:val="left"/>
-            </w:pPr>
-            <w:r>
-              <w:rPr>
-                <w:b w:val="false"/>
-                <w:bCs w:val="false"/>
-                <w:sz w:val="20"/>
-                <w:szCs w:val="20"/>
-              </w:rPr>
-              <w:t xml:space="preserve">간접적 표현을 교과 개념으로 바꿔 해석해야 하는 단서를 받는다</w:t>
-            </w:r>
-          </w:p>
-        </w:tc>
-      </w:tr>
-      <w:tr>
-        <w:tc>
-          <w:tcPr>
-            <w:tcW w:type="dxa" w:w="1800"/>
-            <w:shd w:fill="F5F7F3" w:val="clear"/>
-            <w:tcMar>
-              <w:top w:type="dxa" w:w="100"/>
-              <w:left w:type="dxa" w:w="120"/>
-              <w:bottom w:type="dxa" w:w="100"/>
-              <w:right w:type="dxa" w:w="120"/>
-            </w:tcMar>
-            <w:vAlign w:val="center"/>
-          </w:tcPr>
-          <w:p>
-            <w:pPr>
-              <w:jc w:val="left"/>
-            </w:pPr>
-            <w:r>
-              <w:rPr>
-                <w:b w:val="false"/>
-                <w:bCs w:val="false"/>
-                <w:sz w:val="20"/>
-                <w:szCs w:val="20"/>
-              </w:rPr>
-              <w:t xml:space="preserve">부장</w:t>
-            </w:r>
-          </w:p>
-        </w:tc>
-        <w:tc>
-          <w:tcPr>
-            <w:tcW w:type="dxa" w:w="2200"/>
-            <w:shd w:fill="F5F7F3" w:val="clear"/>
-            <w:tcMar>
-              <w:top w:type="dxa" w:w="100"/>
-              <w:left w:type="dxa" w:w="120"/>
-              <w:bottom w:type="dxa" w:w="100"/>
-              <w:right w:type="dxa" w:w="120"/>
-            </w:tcMar>
-            <w:vAlign w:val="center"/>
-          </w:tcPr>
-          <w:p>
-            <w:pPr>
-              <w:jc w:val="left"/>
-            </w:pPr>
-            <w:r>
-              <w:rPr>
-                <w:b w:val="false"/>
-                <w:bCs w:val="false"/>
-                <w:sz w:val="20"/>
-                <w:szCs w:val="20"/>
-              </w:rPr>
-              <w:t xml:space="preserve">종합판단</w:t>
-            </w:r>
-          </w:p>
-        </w:tc>
-        <w:tc>
-          <w:tcPr>
-            <w:tcW w:type="dxa" w:w="5026"/>
-            <w:shd w:fill="F5F7F3" w:val="clear"/>
-            <w:tcMar>
-              <w:top w:type="dxa" w:w="100"/>
-              <w:left w:type="dxa" w:w="120"/>
-              <w:bottom w:type="dxa" w:w="100"/>
-              <w:right w:type="dxa" w:w="120"/>
-            </w:tcMar>
-            <w:vAlign w:val="center"/>
-          </w:tcPr>
-          <w:p>
-            <w:pPr>
-              <w:jc w:val="left"/>
-            </w:pPr>
-            <w:r>
-              <w:rPr>
-                <w:b w:val="false"/>
-                <w:bCs w:val="false"/>
-                <w:sz w:val="20"/>
-                <w:szCs w:val="20"/>
-              </w:rPr>
-              <w:t xml:space="preserve">가장 추상적인 단서 + 나머지 세 사람의 결과를 모두 취합해 최종 정답을 제출하는 역할</w:t>
+              <w:t xml:space="preserve">책임 있는 소비자로서 소비자의 권리와 역할을 인식하고, 소비생활에서 발생하는 소비자 문제와 해결 방안을 탐색하여 소비생활에 적용한다.</w:t>
             </w:r>
           </w:p>
         </w:tc>
@@ -956,17 +598,13 @@
       </w:pPr>
       <w:r>
         <w:rPr>
-          <w:b/>
-          <w:bCs/>
+          <w:i/>
+          <w:iCs/>
+          <w:color w:val="555555"/>
           <w:sz w:val="21"/>
           <w:szCs w:val="21"/>
         </w:rPr>
-        <w:t xml:space="preserve">모든 문제는 이 구조를 따른다: 인턴·사원·차장이 각자 자기 화면의 문제를 풀어 부분 결과를 얻고 → 서로 말로 전달하고 → 부장이 그것을 종합해 최종 정답을 제출해야 다음 단계로 넘어간다. 부장 화면의 '최종 제출' 버튼은 나머지 세 명이 '확인 완료' 표시를 하기 전까지 비활성화된다.</w:t>
-      </w:r>
-    </w:p>
-    <w:p>
-      <w:r>
-        <w:br w:type="page"/>
+        <w:t xml:space="preserve">9기가02-13은 3단계의 청약철회 트릭 문제 하나에만 가볍게 연결되는 성취기준으로, 단원의 중심은 여전히 9기가01-04(의복디자인·자기표현)와 9기가02-05·06(지속가능한 의생활)이다.</w:t>
       </w:r>
     </w:p>
     <w:p>
@@ -975,7 +613,7 @@
         <w:spacing w:after="200" w:before="400"/>
       </w:pPr>
       <w:r>
-        <w:t xml:space="preserve">1. 등장인물 및 전체 사건 구조</w:t>
+        <w:t xml:space="preserve">2. 등장인물 및 전체 사건 구조</w:t>
       </w:r>
     </w:p>
     <w:tbl>
@@ -1282,7 +920,7 @@
           <w:sz w:val="21"/>
           <w:szCs w:val="21"/>
         </w:rPr>
-        <w:t xml:space="preserve">전체 흐름: 오프닝(사건 발견) → 1단계(숨긴 진짜 원단 찾기) → 2단계(사라진 모델 오지수의 스타일 복원) → 3단계(강태오의 진짜 계획서 발견·교체) → 제출 → 개인 디자인·소감.</w:t>
+        <w:t xml:space="preserve">전체 흐름: 오프닝(사건 발견) → 1단계(디자인요소실 — 숨긴 진짜 원단 찾기) → 2단계(스타일링실 — 사라진 모델의 스타일 복원) → 3단계(TPO+마련계획실 — 강태오의 진짜 계획을 막고 지속가능한 마련 계획으로 교체) → 제출 → 개인 디자인·소감.</w:t>
       </w:r>
     </w:p>
     <w:p>
@@ -1291,7 +929,7 @@
         <w:spacing w:after="200" w:before="400"/>
       </w:pPr>
       <w:r>
-        <w:t xml:space="preserve">2. 오프닝 — 사건의 시작</w:t>
+        <w:t xml:space="preserve">3. 오프닝 — 사건의 시작</w:t>
       </w:r>
     </w:p>
     <w:p>
@@ -1937,6 +1575,21 @@
       </w:r>
     </w:p>
     <w:p>
+      <w:pPr>
+        <w:spacing w:after="160" w:line="300"/>
+      </w:pPr>
+      <w:r>
+        <w:rPr>
+          <w:i/>
+          <w:iCs/>
+          <w:color w:val="555555"/>
+          <w:sz w:val="21"/>
+          <w:szCs w:val="21"/>
+        </w:rPr>
+        <w:t xml:space="preserve">다이어리 맨 뒷장에는 손으로 그린 약도가 있었다. 세 개의 방에 화살표가 표시되어 있고, 첫 번째 화살표 끝에는 '디자인의 본질이 담긴 방'이라는 메모와 함께 지금 서 있는 복도의 첫 번째 문이 정확히 겹쳐 있었다. 한서연은 이 순간을 예상하고 있었던 것처럼, 문 앞에 원단 견본들을 미리 배치해 두었다.</w:t>
+      </w:r>
+    </w:p>
+    <w:p>
       <w:r>
         <w:br w:type="page"/>
       </w:r>
@@ -1947,7 +1600,7 @@
         <w:spacing w:after="200" w:before="400"/>
       </w:pPr>
       <w:r>
-        <w:t xml:space="preserve">3. 1단계 — 디자인요소실: 숨겨진 원단을 찾아라</w:t>
+        <w:t xml:space="preserve">4. 1단계 — 디자인요소실: 숨겨진 원단을 찾아라</w:t>
       </w:r>
     </w:p>
     <w:p>
@@ -1956,7 +1609,7 @@
         <w:spacing w:after="150" w:before="300"/>
       </w:pPr>
       <w:r>
-        <w:t xml:space="preserve">3-1. 목격자 진술 — 몽타주로 원단을 특정하라</w:t>
+        <w:t xml:space="preserve">4-1. 목격자 진술 — 반전 트릭이 숨어 있는 몽타주</w:t>
       </w:r>
     </w:p>
     <w:p>
@@ -1968,7 +1621,7 @@
           <w:sz w:val="21"/>
           <w:szCs w:val="21"/>
         </w:rPr>
-        <w:t xml:space="preserve">경비실에서 발견된 목격자 진술서 한 문장이 네 조각으로 나뉘어 각 직급에게 배정된다.</w:t>
+        <w:t xml:space="preserve">경비실에서 발견된 목격자 진술서 한 문장이 네 조각으로 나뉘어 각 직급에게 배정된다. ⚠ 이 문제에는 함정이 있다.</w:t>
       </w:r>
     </w:p>
     <w:tbl>
@@ -2364,7 +2017,7 @@
                 <w:sz w:val="20"/>
                 <w:szCs w:val="20"/>
               </w:rPr>
-              <w:t xml:space="preserve">'위아래로 쭉 뻗은 줄무늬가 있었다' — 어떤 선?</w:t>
+              <w:t xml:space="preserve">'서늘한 느낌의 색이었다' — 어떤 색?</w:t>
             </w:r>
           </w:p>
         </w:tc>
@@ -2390,7 +2043,7 @@
                 <w:sz w:val="20"/>
                 <w:szCs w:val="20"/>
               </w:rPr>
-              <w:t xml:space="preserve">줄무늬의 방향을 떠올려 세로/가로 중 골라보세요</w:t>
+              <w:t xml:space="preserve">차갑거나 따뜻한 인상을 주는 색 계열을 떠올려보세요</w:t>
             </w:r>
           </w:p>
         </w:tc>
@@ -2416,7 +2069,7 @@
                 <w:sz w:val="20"/>
                 <w:szCs w:val="20"/>
               </w:rPr>
-              <w:t xml:space="preserve">정답: 세로선 / 해설: '위아래로 쭉'은 세로 방향을 뜻한다</w:t>
+              <w:t xml:space="preserve">정답: 한색 / 해설: 초록·파랑 등 차가운 색은 한색이다</w:t>
             </w:r>
           </w:p>
         </w:tc>
@@ -2472,7 +2125,7 @@
                 <w:sz w:val="20"/>
                 <w:szCs w:val="20"/>
               </w:rPr>
-              <w:t xml:space="preserve">'보기만 해도 서늘한 느낌이었다' — 어떤 색? + 종합판정</w:t>
+              <w:t xml:space="preserve">'가느다란 가로줄무늬가 촘촘하게 있었는데, 이상하게 폭이 좁고 길어 보였다' — 어떤 선? + 종합판정</w:t>
             </w:r>
           </w:p>
         </w:tc>
@@ -2499,7 +2152,7 @@
                 <w:sz w:val="20"/>
                 <w:szCs w:val="20"/>
               </w:rPr>
-              <w:t xml:space="preserve">차갑거나 따뜻한 인상을 주는 색 계열을 떠올려보세요</w:t>
+              <w:t xml:space="preserve">교과서에 나온 예외 규칙을 떠올려보세요: 가는 선이 여러 개 반복되면 어떤 효과가 날까요?</w:t>
             </w:r>
           </w:p>
         </w:tc>
@@ -2526,7 +2179,7 @@
                 <w:sz w:val="20"/>
                 <w:szCs w:val="20"/>
               </w:rPr>
-              <w:t xml:space="preserve">정답: 한색 / 종합정답: 원단 B / 해설: 세 사람의 결과(작은무늬·뻣뻣한재질·세로선)와 자신의 한색을 합치면 원단 B와 정확히 일치한다</w:t>
+              <w:t xml:space="preserve">정답: 가로선(단, 가늘고 촘촘한 반복형) / 종합정답: 원단 B / 해설: 보통 가로선은 폭을 넓어 보이게 하지만, 가늘게 반복되면 시선이 위아래로 분산되어 오히려 세로선처럼 길어 보이는 착시가 생긴다(교과서 2-3-1차시). '가로선=넓어 보임'이라는 상식만으로 풀면 함정에 빠진다.</w:t>
             </w:r>
           </w:p>
         </w:tc>
@@ -2558,8 +2211,7 @@
       </w:tblPr>
       <w:tblGrid>
         <w:gridCol w:w="1400"/>
-        <w:gridCol w:w="1800"/>
-        <w:gridCol w:w="1800"/>
+        <w:gridCol w:w="2600"/>
         <w:gridCol w:w="1800"/>
         <w:gridCol w:w="2226"/>
       </w:tblGrid>
@@ -2593,6 +2245,33 @@
         </w:tc>
         <w:tc>
           <w:tcPr>
+            <w:tcW w:type="dxa" w:w="2600"/>
+            <w:shd w:fill="D9E2D0" w:val="clear"/>
+            <w:tcMar>
+              <w:top w:type="dxa" w:w="100"/>
+              <w:left w:type="dxa" w:w="120"/>
+              <w:bottom w:type="dxa" w:w="100"/>
+              <w:right w:type="dxa" w:w="120"/>
+            </w:tcMar>
+            <w:vAlign w:val="center"/>
+          </w:tcPr>
+          <w:p>
+            <w:pPr>
+              <w:jc w:val="left"/>
+            </w:pPr>
+            <w:r>
+              <w:rPr>
+                <w:b/>
+                <w:bCs/>
+                <w:sz w:val="20"/>
+                <w:szCs w:val="20"/>
+              </w:rPr>
+              <w:t xml:space="preserve">선</w:t>
+            </w:r>
+          </w:p>
+        </w:tc>
+        <w:tc>
+          <w:tcPr>
             <w:tcW w:type="dxa" w:w="1800"/>
             <w:shd w:fill="D9E2D0" w:val="clear"/>
             <w:tcMar>
@@ -2614,13 +2293,13 @@
                 <w:sz w:val="20"/>
                 <w:szCs w:val="20"/>
               </w:rPr>
-              <w:t xml:space="preserve">선</w:t>
-            </w:r>
-          </w:p>
-        </w:tc>
-        <w:tc>
-          <w:tcPr>
-            <w:tcW w:type="dxa" w:w="1800"/>
+              <w:t xml:space="preserve">색·재질·무늬</w:t>
+            </w:r>
+          </w:p>
+        </w:tc>
+        <w:tc>
+          <w:tcPr>
+            <w:tcW w:type="dxa" w:w="2226"/>
             <w:shd w:fill="D9E2D0" w:val="clear"/>
             <w:tcMar>
               <w:top w:type="dxa" w:w="100"/>
@@ -2641,61 +2320,7 @@
                 <w:sz w:val="20"/>
                 <w:szCs w:val="20"/>
               </w:rPr>
-              <w:t xml:space="preserve">색</w:t>
-            </w:r>
-          </w:p>
-        </w:tc>
-        <w:tc>
-          <w:tcPr>
-            <w:tcW w:type="dxa" w:w="1800"/>
-            <w:shd w:fill="D9E2D0" w:val="clear"/>
-            <w:tcMar>
-              <w:top w:type="dxa" w:w="100"/>
-              <w:left w:type="dxa" w:w="120"/>
-              <w:bottom w:type="dxa" w:w="100"/>
-              <w:right w:type="dxa" w:w="120"/>
-            </w:tcMar>
-            <w:vAlign w:val="center"/>
-          </w:tcPr>
-          <w:p>
-            <w:pPr>
-              <w:jc w:val="left"/>
-            </w:pPr>
-            <w:r>
-              <w:rPr>
-                <w:b/>
-                <w:bCs/>
-                <w:sz w:val="20"/>
-                <w:szCs w:val="20"/>
-              </w:rPr>
-              <w:t xml:space="preserve">재질</w:t>
-            </w:r>
-          </w:p>
-        </w:tc>
-        <w:tc>
-          <w:tcPr>
-            <w:tcW w:type="dxa" w:w="2226"/>
-            <w:shd w:fill="D9E2D0" w:val="clear"/>
-            <w:tcMar>
-              <w:top w:type="dxa" w:w="100"/>
-              <w:left w:type="dxa" w:w="120"/>
-              <w:bottom w:type="dxa" w:w="100"/>
-              <w:right w:type="dxa" w:w="120"/>
-            </w:tcMar>
-            <w:vAlign w:val="center"/>
-          </w:tcPr>
-          <w:p>
-            <w:pPr>
-              <w:jc w:val="left"/>
-            </w:pPr>
-            <w:r>
-              <w:rPr>
-                <w:b/>
-                <w:bCs/>
-                <w:sz w:val="20"/>
-                <w:szCs w:val="20"/>
-              </w:rPr>
-              <w:t xml:space="preserve">무늬</w:t>
+              <w:t xml:space="preserve">설명</w:t>
             </w:r>
           </w:p>
         </w:tc>
@@ -2729,6 +2354,32 @@
         </w:tc>
         <w:tc>
           <w:tcPr>
+            <w:tcW w:type="dxa" w:w="2600"/>
+            <w:tcMar>
+              <w:top w:type="dxa" w:w="100"/>
+              <w:left w:type="dxa" w:w="120"/>
+              <w:bottom w:type="dxa" w:w="100"/>
+              <w:right w:type="dxa" w:w="120"/>
+            </w:tcMar>
+            <w:vAlign w:val="center"/>
+          </w:tcPr>
+          <w:p>
+            <w:pPr>
+              <w:jc w:val="left"/>
+            </w:pPr>
+            <w:r>
+              <w:rPr>
+                <w:b w:val="false"/>
+                <w:bCs w:val="false"/>
+                <w:sz w:val="20"/>
+                <w:szCs w:val="20"/>
+              </w:rPr>
+              <w:t xml:space="preserve">굵은 세로선(적은 개수)</w:t>
+            </w:r>
+          </w:p>
+        </w:tc>
+        <w:tc>
+          <w:tcPr>
             <w:tcW w:type="dxa" w:w="1800"/>
             <w:tcMar>
               <w:top w:type="dxa" w:w="100"/>
@@ -2749,59 +2400,7 @@
                 <w:sz w:val="20"/>
                 <w:szCs w:val="20"/>
               </w:rPr>
-              <w:t xml:space="preserve">세로선</w:t>
-            </w:r>
-          </w:p>
-        </w:tc>
-        <w:tc>
-          <w:tcPr>
-            <w:tcW w:type="dxa" w:w="1800"/>
-            <w:tcMar>
-              <w:top w:type="dxa" w:w="100"/>
-              <w:left w:type="dxa" w:w="120"/>
-              <w:bottom w:type="dxa" w:w="100"/>
-              <w:right w:type="dxa" w:w="120"/>
-            </w:tcMar>
-            <w:vAlign w:val="center"/>
-          </w:tcPr>
-          <w:p>
-            <w:pPr>
-              <w:jc w:val="left"/>
-            </w:pPr>
-            <w:r>
-              <w:rPr>
-                <w:b w:val="false"/>
-                <w:bCs w:val="false"/>
-                <w:sz w:val="20"/>
-                <w:szCs w:val="20"/>
-              </w:rPr>
-              <w:t xml:space="preserve">난색</w:t>
-            </w:r>
-          </w:p>
-        </w:tc>
-        <w:tc>
-          <w:tcPr>
-            <w:tcW w:type="dxa" w:w="1800"/>
-            <w:tcMar>
-              <w:top w:type="dxa" w:w="100"/>
-              <w:left w:type="dxa" w:w="120"/>
-              <w:bottom w:type="dxa" w:w="100"/>
-              <w:right w:type="dxa" w:w="120"/>
-            </w:tcMar>
-            <w:vAlign w:val="center"/>
-          </w:tcPr>
-          <w:p>
-            <w:pPr>
-              <w:jc w:val="left"/>
-            </w:pPr>
-            <w:r>
-              <w:rPr>
-                <w:b w:val="false"/>
-                <w:bCs w:val="false"/>
-                <w:sz w:val="20"/>
-                <w:szCs w:val="20"/>
-              </w:rPr>
-              <w:t xml:space="preserve">부드러운</w:t>
+              <w:t xml:space="preserve">난색·부드러운·큰무늬</w:t>
             </w:r>
           </w:p>
         </w:tc>
@@ -2827,7 +2426,7 @@
                 <w:sz w:val="20"/>
                 <w:szCs w:val="20"/>
               </w:rPr>
-              <w:t xml:space="preserve">큰무늬</w:t>
+              <w:t xml:space="preserve">함정: '세로선'이라는 단어에 낚이기 쉬우나 색·재질·무늬가 불일치</w:t>
             </w:r>
           </w:p>
         </w:tc>
@@ -2862,6 +2461,33 @@
         </w:tc>
         <w:tc>
           <w:tcPr>
+            <w:tcW w:type="dxa" w:w="2600"/>
+            <w:shd w:fill="F5F7F3" w:val="clear"/>
+            <w:tcMar>
+              <w:top w:type="dxa" w:w="100"/>
+              <w:left w:type="dxa" w:w="120"/>
+              <w:bottom w:type="dxa" w:w="100"/>
+              <w:right w:type="dxa" w:w="120"/>
+            </w:tcMar>
+            <w:vAlign w:val="center"/>
+          </w:tcPr>
+          <w:p>
+            <w:pPr>
+              <w:jc w:val="left"/>
+            </w:pPr>
+            <w:r>
+              <w:rPr>
+                <w:b w:val="false"/>
+                <w:bCs w:val="false"/>
+                <w:sz w:val="20"/>
+                <w:szCs w:val="20"/>
+              </w:rPr>
+              <w:t xml:space="preserve">가늘고 촘촘한 가로줄무늬</w:t>
+            </w:r>
+          </w:p>
+        </w:tc>
+        <w:tc>
+          <w:tcPr>
             <w:tcW w:type="dxa" w:w="1800"/>
             <w:shd w:fill="F5F7F3" w:val="clear"/>
             <w:tcMar>
@@ -2883,7 +2509,196 @@
                 <w:sz w:val="20"/>
                 <w:szCs w:val="20"/>
               </w:rPr>
-              <w:t xml:space="preserve">세로선</w:t>
+              <w:t xml:space="preserve">한색·뻣뻣한·작은무늬</w:t>
+            </w:r>
+          </w:p>
+        </w:tc>
+        <w:tc>
+          <w:tcPr>
+            <w:tcW w:type="dxa" w:w="2226"/>
+            <w:shd w:fill="F5F7F3" w:val="clear"/>
+            <w:tcMar>
+              <w:top w:type="dxa" w:w="100"/>
+              <w:left w:type="dxa" w:w="120"/>
+              <w:bottom w:type="dxa" w:w="100"/>
+              <w:right w:type="dxa" w:w="120"/>
+            </w:tcMar>
+            <w:vAlign w:val="center"/>
+          </w:tcPr>
+          <w:p>
+            <w:pPr>
+              <w:jc w:val="left"/>
+            </w:pPr>
+            <w:r>
+              <w:rPr>
+                <w:b w:val="false"/>
+                <w:bCs w:val="false"/>
+                <w:sz w:val="20"/>
+                <w:szCs w:val="20"/>
+              </w:rPr>
+              <w:t xml:space="preserve">정답 — 반전 트릭 적용 원단</w:t>
+            </w:r>
+          </w:p>
+        </w:tc>
+      </w:tr>
+      <w:tr>
+        <w:tc>
+          <w:tcPr>
+            <w:tcW w:type="dxa" w:w="1400"/>
+            <w:tcMar>
+              <w:top w:type="dxa" w:w="100"/>
+              <w:left w:type="dxa" w:w="120"/>
+              <w:bottom w:type="dxa" w:w="100"/>
+              <w:right w:type="dxa" w:w="120"/>
+            </w:tcMar>
+            <w:vAlign w:val="center"/>
+          </w:tcPr>
+          <w:p>
+            <w:pPr>
+              <w:jc w:val="left"/>
+            </w:pPr>
+            <w:r>
+              <w:rPr>
+                <w:b w:val="false"/>
+                <w:bCs w:val="false"/>
+                <w:sz w:val="20"/>
+                <w:szCs w:val="20"/>
+              </w:rPr>
+              <w:t xml:space="preserve">C</w:t>
+            </w:r>
+          </w:p>
+        </w:tc>
+        <w:tc>
+          <w:tcPr>
+            <w:tcW w:type="dxa" w:w="2600"/>
+            <w:tcMar>
+              <w:top w:type="dxa" w:w="100"/>
+              <w:left w:type="dxa" w:w="120"/>
+              <w:bottom w:type="dxa" w:w="100"/>
+              <w:right w:type="dxa" w:w="120"/>
+            </w:tcMar>
+            <w:vAlign w:val="center"/>
+          </w:tcPr>
+          <w:p>
+            <w:pPr>
+              <w:jc w:val="left"/>
+            </w:pPr>
+            <w:r>
+              <w:rPr>
+                <w:b w:val="false"/>
+                <w:bCs w:val="false"/>
+                <w:sz w:val="20"/>
+                <w:szCs w:val="20"/>
+              </w:rPr>
+              <w:t xml:space="preserve">굵은 가로선(적은 개수)</w:t>
+            </w:r>
+          </w:p>
+        </w:tc>
+        <w:tc>
+          <w:tcPr>
+            <w:tcW w:type="dxa" w:w="1800"/>
+            <w:tcMar>
+              <w:top w:type="dxa" w:w="100"/>
+              <w:left w:type="dxa" w:w="120"/>
+              <w:bottom w:type="dxa" w:w="100"/>
+              <w:right w:type="dxa" w:w="120"/>
+            </w:tcMar>
+            <w:vAlign w:val="center"/>
+          </w:tcPr>
+          <w:p>
+            <w:pPr>
+              <w:jc w:val="left"/>
+            </w:pPr>
+            <w:r>
+              <w:rPr>
+                <w:b w:val="false"/>
+                <w:bCs w:val="false"/>
+                <w:sz w:val="20"/>
+                <w:szCs w:val="20"/>
+              </w:rPr>
+              <w:t xml:space="preserve">한색·뻣뻣한·큰무늬</w:t>
+            </w:r>
+          </w:p>
+        </w:tc>
+        <w:tc>
+          <w:tcPr>
+            <w:tcW w:type="dxa" w:w="2226"/>
+            <w:tcMar>
+              <w:top w:type="dxa" w:w="100"/>
+              <w:left w:type="dxa" w:w="120"/>
+              <w:bottom w:type="dxa" w:w="100"/>
+              <w:right w:type="dxa" w:w="120"/>
+            </w:tcMar>
+            <w:vAlign w:val="center"/>
+          </w:tcPr>
+          <w:p>
+            <w:pPr>
+              <w:jc w:val="left"/>
+            </w:pPr>
+            <w:r>
+              <w:rPr>
+                <w:b w:val="false"/>
+                <w:bCs w:val="false"/>
+                <w:sz w:val="20"/>
+                <w:szCs w:val="20"/>
+              </w:rPr>
+              <w:t xml:space="preserve">함정: 색·재질은 맞지만 '넓어 보이는' 일반적 가로선이라 무늬 불일치</w:t>
+            </w:r>
+          </w:p>
+        </w:tc>
+      </w:tr>
+      <w:tr>
+        <w:tc>
+          <w:tcPr>
+            <w:tcW w:type="dxa" w:w="1400"/>
+            <w:shd w:fill="F5F7F3" w:val="clear"/>
+            <w:tcMar>
+              <w:top w:type="dxa" w:w="100"/>
+              <w:left w:type="dxa" w:w="120"/>
+              <w:bottom w:type="dxa" w:w="100"/>
+              <w:right w:type="dxa" w:w="120"/>
+            </w:tcMar>
+            <w:vAlign w:val="center"/>
+          </w:tcPr>
+          <w:p>
+            <w:pPr>
+              <w:jc w:val="left"/>
+            </w:pPr>
+            <w:r>
+              <w:rPr>
+                <w:b w:val="false"/>
+                <w:bCs w:val="false"/>
+                <w:sz w:val="20"/>
+                <w:szCs w:val="20"/>
+              </w:rPr>
+              <w:t xml:space="preserve">D</w:t>
+            </w:r>
+          </w:p>
+        </w:tc>
+        <w:tc>
+          <w:tcPr>
+            <w:tcW w:type="dxa" w:w="2600"/>
+            <w:shd w:fill="F5F7F3" w:val="clear"/>
+            <w:tcMar>
+              <w:top w:type="dxa" w:w="100"/>
+              <w:left w:type="dxa" w:w="120"/>
+              <w:bottom w:type="dxa" w:w="100"/>
+              <w:right w:type="dxa" w:w="120"/>
+            </w:tcMar>
+            <w:vAlign w:val="center"/>
+          </w:tcPr>
+          <w:p>
+            <w:pPr>
+              <w:jc w:val="left"/>
+            </w:pPr>
+            <w:r>
+              <w:rPr>
+                <w:b w:val="false"/>
+                <w:bCs w:val="false"/>
+                <w:sz w:val="20"/>
+                <w:szCs w:val="20"/>
+              </w:rPr>
+              <w:t xml:space="preserve">사선</w:t>
             </w:r>
           </w:p>
         </w:tc>
@@ -2910,34 +2725,7 @@
                 <w:sz w:val="20"/>
                 <w:szCs w:val="20"/>
               </w:rPr>
-              <w:t xml:space="preserve">한색</w:t>
-            </w:r>
-          </w:p>
-        </w:tc>
-        <w:tc>
-          <w:tcPr>
-            <w:tcW w:type="dxa" w:w="1800"/>
-            <w:shd w:fill="F5F7F3" w:val="clear"/>
-            <w:tcMar>
-              <w:top w:type="dxa" w:w="100"/>
-              <w:left w:type="dxa" w:w="120"/>
-              <w:bottom w:type="dxa" w:w="100"/>
-              <w:right w:type="dxa" w:w="120"/>
-            </w:tcMar>
-            <w:vAlign w:val="center"/>
-          </w:tcPr>
-          <w:p>
-            <w:pPr>
-              <w:jc w:val="left"/>
-            </w:pPr>
-            <w:r>
-              <w:rPr>
-                <w:b w:val="false"/>
-                <w:bCs w:val="false"/>
-                <w:sz w:val="20"/>
-                <w:szCs w:val="20"/>
-              </w:rPr>
-              <w:t xml:space="preserve">뻣뻣한</w:t>
+              <w:t xml:space="preserve">난색·부드러운·작은무늬</w:t>
             </w:r>
           </w:p>
         </w:tc>
@@ -2964,276 +2752,7 @@
                 <w:sz w:val="20"/>
                 <w:szCs w:val="20"/>
               </w:rPr>
-              <w:t xml:space="preserve">작은무늬</w:t>
-            </w:r>
-          </w:p>
-        </w:tc>
-      </w:tr>
-      <w:tr>
-        <w:tc>
-          <w:tcPr>
-            <w:tcW w:type="dxa" w:w="1400"/>
-            <w:tcMar>
-              <w:top w:type="dxa" w:w="100"/>
-              <w:left w:type="dxa" w:w="120"/>
-              <w:bottom w:type="dxa" w:w="100"/>
-              <w:right w:type="dxa" w:w="120"/>
-            </w:tcMar>
-            <w:vAlign w:val="center"/>
-          </w:tcPr>
-          <w:p>
-            <w:pPr>
-              <w:jc w:val="left"/>
-            </w:pPr>
-            <w:r>
-              <w:rPr>
-                <w:b w:val="false"/>
-                <w:bCs w:val="false"/>
-                <w:sz w:val="20"/>
-                <w:szCs w:val="20"/>
-              </w:rPr>
-              <w:t xml:space="preserve">C</w:t>
-            </w:r>
-          </w:p>
-        </w:tc>
-        <w:tc>
-          <w:tcPr>
-            <w:tcW w:type="dxa" w:w="1800"/>
-            <w:tcMar>
-              <w:top w:type="dxa" w:w="100"/>
-              <w:left w:type="dxa" w:w="120"/>
-              <w:bottom w:type="dxa" w:w="100"/>
-              <w:right w:type="dxa" w:w="120"/>
-            </w:tcMar>
-            <w:vAlign w:val="center"/>
-          </w:tcPr>
-          <w:p>
-            <w:pPr>
-              <w:jc w:val="left"/>
-            </w:pPr>
-            <w:r>
-              <w:rPr>
-                <w:b w:val="false"/>
-                <w:bCs w:val="false"/>
-                <w:sz w:val="20"/>
-                <w:szCs w:val="20"/>
-              </w:rPr>
-              <w:t xml:space="preserve">가로선</w:t>
-            </w:r>
-          </w:p>
-        </w:tc>
-        <w:tc>
-          <w:tcPr>
-            <w:tcW w:type="dxa" w:w="1800"/>
-            <w:tcMar>
-              <w:top w:type="dxa" w:w="100"/>
-              <w:left w:type="dxa" w:w="120"/>
-              <w:bottom w:type="dxa" w:w="100"/>
-              <w:right w:type="dxa" w:w="120"/>
-            </w:tcMar>
-            <w:vAlign w:val="center"/>
-          </w:tcPr>
-          <w:p>
-            <w:pPr>
-              <w:jc w:val="left"/>
-            </w:pPr>
-            <w:r>
-              <w:rPr>
-                <w:b w:val="false"/>
-                <w:bCs w:val="false"/>
-                <w:sz w:val="20"/>
-                <w:szCs w:val="20"/>
-              </w:rPr>
-              <w:t xml:space="preserve">한색</w:t>
-            </w:r>
-          </w:p>
-        </w:tc>
-        <w:tc>
-          <w:tcPr>
-            <w:tcW w:type="dxa" w:w="1800"/>
-            <w:tcMar>
-              <w:top w:type="dxa" w:w="100"/>
-              <w:left w:type="dxa" w:w="120"/>
-              <w:bottom w:type="dxa" w:w="100"/>
-              <w:right w:type="dxa" w:w="120"/>
-            </w:tcMar>
-            <w:vAlign w:val="center"/>
-          </w:tcPr>
-          <w:p>
-            <w:pPr>
-              <w:jc w:val="left"/>
-            </w:pPr>
-            <w:r>
-              <w:rPr>
-                <w:b w:val="false"/>
-                <w:bCs w:val="false"/>
-                <w:sz w:val="20"/>
-                <w:szCs w:val="20"/>
-              </w:rPr>
-              <w:t xml:space="preserve">뻣뻣한</w:t>
-            </w:r>
-          </w:p>
-        </w:tc>
-        <w:tc>
-          <w:tcPr>
-            <w:tcW w:type="dxa" w:w="2226"/>
-            <w:tcMar>
-              <w:top w:type="dxa" w:w="100"/>
-              <w:left w:type="dxa" w:w="120"/>
-              <w:bottom w:type="dxa" w:w="100"/>
-              <w:right w:type="dxa" w:w="120"/>
-            </w:tcMar>
-            <w:vAlign w:val="center"/>
-          </w:tcPr>
-          <w:p>
-            <w:pPr>
-              <w:jc w:val="left"/>
-            </w:pPr>
-            <w:r>
-              <w:rPr>
-                <w:b w:val="false"/>
-                <w:bCs w:val="false"/>
-                <w:sz w:val="20"/>
-                <w:szCs w:val="20"/>
-              </w:rPr>
-              <w:t xml:space="preserve">큰무늬</w:t>
-            </w:r>
-          </w:p>
-        </w:tc>
-      </w:tr>
-      <w:tr>
-        <w:tc>
-          <w:tcPr>
-            <w:tcW w:type="dxa" w:w="1400"/>
-            <w:shd w:fill="F5F7F3" w:val="clear"/>
-            <w:tcMar>
-              <w:top w:type="dxa" w:w="100"/>
-              <w:left w:type="dxa" w:w="120"/>
-              <w:bottom w:type="dxa" w:w="100"/>
-              <w:right w:type="dxa" w:w="120"/>
-            </w:tcMar>
-            <w:vAlign w:val="center"/>
-          </w:tcPr>
-          <w:p>
-            <w:pPr>
-              <w:jc w:val="left"/>
-            </w:pPr>
-            <w:r>
-              <w:rPr>
-                <w:b w:val="false"/>
-                <w:bCs w:val="false"/>
-                <w:sz w:val="20"/>
-                <w:szCs w:val="20"/>
-              </w:rPr>
-              <w:t xml:space="preserve">D</w:t>
-            </w:r>
-          </w:p>
-        </w:tc>
-        <w:tc>
-          <w:tcPr>
-            <w:tcW w:type="dxa" w:w="1800"/>
-            <w:shd w:fill="F5F7F3" w:val="clear"/>
-            <w:tcMar>
-              <w:top w:type="dxa" w:w="100"/>
-              <w:left w:type="dxa" w:w="120"/>
-              <w:bottom w:type="dxa" w:w="100"/>
-              <w:right w:type="dxa" w:w="120"/>
-            </w:tcMar>
-            <w:vAlign w:val="center"/>
-          </w:tcPr>
-          <w:p>
-            <w:pPr>
-              <w:jc w:val="left"/>
-            </w:pPr>
-            <w:r>
-              <w:rPr>
-                <w:b w:val="false"/>
-                <w:bCs w:val="false"/>
-                <w:sz w:val="20"/>
-                <w:szCs w:val="20"/>
-              </w:rPr>
-              <w:t xml:space="preserve">가로선</w:t>
-            </w:r>
-          </w:p>
-        </w:tc>
-        <w:tc>
-          <w:tcPr>
-            <w:tcW w:type="dxa" w:w="1800"/>
-            <w:shd w:fill="F5F7F3" w:val="clear"/>
-            <w:tcMar>
-              <w:top w:type="dxa" w:w="100"/>
-              <w:left w:type="dxa" w:w="120"/>
-              <w:bottom w:type="dxa" w:w="100"/>
-              <w:right w:type="dxa" w:w="120"/>
-            </w:tcMar>
-            <w:vAlign w:val="center"/>
-          </w:tcPr>
-          <w:p>
-            <w:pPr>
-              <w:jc w:val="left"/>
-            </w:pPr>
-            <w:r>
-              <w:rPr>
-                <w:b w:val="false"/>
-                <w:bCs w:val="false"/>
-                <w:sz w:val="20"/>
-                <w:szCs w:val="20"/>
-              </w:rPr>
-              <w:t xml:space="preserve">난색</w:t>
-            </w:r>
-          </w:p>
-        </w:tc>
-        <w:tc>
-          <w:tcPr>
-            <w:tcW w:type="dxa" w:w="1800"/>
-            <w:shd w:fill="F5F7F3" w:val="clear"/>
-            <w:tcMar>
-              <w:top w:type="dxa" w:w="100"/>
-              <w:left w:type="dxa" w:w="120"/>
-              <w:bottom w:type="dxa" w:w="100"/>
-              <w:right w:type="dxa" w:w="120"/>
-            </w:tcMar>
-            <w:vAlign w:val="center"/>
-          </w:tcPr>
-          <w:p>
-            <w:pPr>
-              <w:jc w:val="left"/>
-            </w:pPr>
-            <w:r>
-              <w:rPr>
-                <w:b w:val="false"/>
-                <w:bCs w:val="false"/>
-                <w:sz w:val="20"/>
-                <w:szCs w:val="20"/>
-              </w:rPr>
-              <w:t xml:space="preserve">부드러운</w:t>
-            </w:r>
-          </w:p>
-        </w:tc>
-        <w:tc>
-          <w:tcPr>
-            <w:tcW w:type="dxa" w:w="2226"/>
-            <w:shd w:fill="F5F7F3" w:val="clear"/>
-            <w:tcMar>
-              <w:top w:type="dxa" w:w="100"/>
-              <w:left w:type="dxa" w:w="120"/>
-              <w:bottom w:type="dxa" w:w="100"/>
-              <w:right w:type="dxa" w:w="120"/>
-            </w:tcMar>
-            <w:vAlign w:val="center"/>
-          </w:tcPr>
-          <w:p>
-            <w:pPr>
-              <w:jc w:val="left"/>
-            </w:pPr>
-            <w:r>
-              <w:rPr>
-                <w:b w:val="false"/>
-                <w:bCs w:val="false"/>
-                <w:sz w:val="20"/>
-                <w:szCs w:val="20"/>
-              </w:rPr>
-              <w:t xml:space="preserve">작은무늬</w:t>
+              <w:t xml:space="preserve">함정: 무늬만 일치</w:t>
             </w:r>
           </w:p>
         </w:tc>
@@ -3245,7 +2764,22 @@
         <w:spacing w:after="150" w:before="300"/>
       </w:pPr>
       <w:r>
-        <w:t xml:space="preserve">3-2. 세 가지 기준으로 진짜를 가려내라</w:t>
+        <w:t xml:space="preserve">4-2. 세 가지 기준으로 진짜를 가려내라</w:t>
+      </w:r>
+    </w:p>
+    <w:p>
+      <w:pPr>
+        <w:spacing w:after="160" w:line="300"/>
+      </w:pPr>
+      <w:r>
+        <w:rPr>
+          <w:i/>
+          <w:iCs/>
+          <w:color w:val="555555"/>
+          <w:sz w:val="21"/>
+          <w:szCs w:val="21"/>
+        </w:rPr>
+        <w:t xml:space="preserve">원단 B를 집어 드는 순간, 라벨 안쪽에 작게 접힌 쪽지 하나가 떨어졌다. '진짜인지 확인하려면, 옆에 있는 후보들과 비교해봐. 나는 원단 하나만 남긴 게 아니라, 누군가 몰래 바꿔치기하지 못하도록 가짜들까지 함께 심어뒀어.' 고개를 들어보니 정말로 선반 위에 비슷하게 생긴 원단 다섯 개가 나란히 놓여 있었다.</w:t>
       </w:r>
     </w:p>
     <w:p>
@@ -3886,7 +3420,7 @@
                 <w:sz w:val="20"/>
                 <w:szCs w:val="20"/>
               </w:rPr>
-              <w:t xml:space="preserve">세 목록의 교집합을 구하는 문제다. E·F·G는 각각 한 목록에서만 빠지는 함정이고, H만 세 목록 모두에 들어 있다. 지속가능성은 한 가지 기준이 아니라 여러 기준을 동시에 충족해야 한다는 것을 팀 전체의 협력으로 확인하게 하는 문항이다.</w:t>
+              <w:t xml:space="preserve">세 목록의 교집합을 구하는 문제다. E·F·G는 각각 한 목록에서만 빠지는 함정이고, H만 세 목록 모두에 들어 있다.</w:t>
             </w:r>
           </w:p>
         </w:tc>
@@ -4737,7 +4271,22 @@
         <w:spacing w:after="150" w:before="300"/>
       </w:pPr>
       <w:r>
-        <w:t xml:space="preserve">3-3. 실천적 추론 — 대표의 압박</w:t>
+        <w:t xml:space="preserve">4-3. 실천적 추론 — 대표의 압박</w:t>
+      </w:r>
+    </w:p>
+    <w:p>
+      <w:pPr>
+        <w:spacing w:after="160" w:line="300"/>
+      </w:pPr>
+      <w:r>
+        <w:rPr>
+          <w:i/>
+          <w:iCs/>
+          <w:color w:val="555555"/>
+          <w:sz w:val="21"/>
+          <w:szCs w:val="21"/>
+        </w:rPr>
+        <w:t xml:space="preserve">원단 H를 확정하고 나니, 책상 서랍이 저절로 살짝 열려 있었다. 안에는 낯선 필체로 급하게 휘갈겨 쓴 쪽지 한 장이 있었다. 한서연의 단정한 글씨가 아니었다 — 이건 강태오의 것이었다. 그가 이 방에도 다녀갔다는 뜻이었다.</w:t>
       </w:r>
     </w:p>
     <w:tbl>
@@ -4981,6 +4530,21 @@
       </w:r>
     </w:p>
     <w:p>
+      <w:pPr>
+        <w:spacing w:after="160" w:line="300"/>
+      </w:pPr>
+      <w:r>
+        <w:rPr>
+          <w:i/>
+          <w:iCs/>
+          <w:color w:val="555555"/>
+          <w:sz w:val="21"/>
+          <w:szCs w:val="21"/>
+        </w:rPr>
+        <w:t xml:space="preserve">원단 조각을 손에 쥐자 뒷면에 작은 화살표와 함께 글씨가 떠올랐다: '스타일링실 →'. 문을 열고 복도로 나서자, 몇 걸음 앞에 낯익은 운동화 한 짝이 아무렇게나 떨어져 있었다. 이 컬렉션을 입기로 했던 모델, 오지수의 것이었다.</w:t>
+      </w:r>
+    </w:p>
+    <w:p>
       <w:r>
         <w:br w:type="page"/>
       </w:r>
@@ -4991,7 +4555,7 @@
         <w:spacing w:after="200" w:before="400"/>
       </w:pPr>
       <w:r>
-        <w:t xml:space="preserve">4. 2단계 — 스타일링실: 사라진 모델을 위한 스타일을 완성하라</w:t>
+        <w:t xml:space="preserve">5. 2단계 — 스타일링실: 사라진 모델을 위한 스타일을 완성하라</w:t>
       </w:r>
     </w:p>
     <w:p>
@@ -5003,7 +4567,19 @@
           <w:sz w:val="21"/>
           <w:szCs w:val="21"/>
         </w:rPr>
-        <w:t xml:space="preserve">모델 오지수의 개인 소지품 네 가지가 각 직급에게 배정된다.</w:t>
+        <w:t xml:space="preserve">운동화를 따라 들어간 방은 스타일링실이었다. 정작 사람은 없고, 오지수가 급하게 자리를 뜬 흔적만 남아 있었다 — 손목시계, 액세서리함, 옷장 메모, 화장품 파우치가 책상 위에 흩어져 있었다. 왜 그가 갑자기 사라졌는지는 알 수 없었지만, 확실한 건 이 컬렉션을 완성하려면 그를 위한 스타일을 먼저 되찾아야 한다는 것이었다.</w:t>
+      </w:r>
+    </w:p>
+    <w:p>
+      <w:pPr>
+        <w:spacing w:after="160" w:line="300"/>
+      </w:pPr>
+      <w:r>
+        <w:rPr>
+          <w:sz w:val="21"/>
+          <w:szCs w:val="21"/>
+        </w:rPr>
+        <w:t xml:space="preserve">모델 오지수의 개인 소지품 네 가지가 각 직급에게 배정된다. 교과서의 공식 웜톤/쿨톤 판별 기준(햇볕 반응·장신구·머리색·피부기·립스틱·혈관색)을 그대로 사용한다.</w:t>
       </w:r>
     </w:p>
     <w:p>
@@ -5012,7 +4588,7 @@
         <w:spacing w:after="150" w:before="300"/>
       </w:pPr>
       <w:r>
-        <w:t xml:space="preserve">4-1. 퍼스널컬러 추리</w:t>
+        <w:t xml:space="preserve">5-1. 퍼스널컬러 추리 (교과서 공식 기준)</w:t>
       </w:r>
     </w:p>
     <w:tbl>
@@ -5192,7 +4768,7 @@
                 <w:sz w:val="20"/>
                 <w:szCs w:val="20"/>
               </w:rPr>
-              <w:t xml:space="preserve">파운데이션에 남은 메모 '핑크빛이 도는 파운데이션을 썼다' — 어떤 톤?</w:t>
+              <w:t xml:space="preserve">'햇볕에 오래 있으면 얼굴이 빨갛게 익는다' — 어떤 톤?</w:t>
             </w:r>
           </w:p>
         </w:tc>
@@ -5218,7 +4794,7 @@
                 <w:sz w:val="20"/>
                 <w:szCs w:val="20"/>
               </w:rPr>
-              <w:t xml:space="preserve">핑크빛은 차갑고 쿨한 느낌의 피부 표현입니다</w:t>
+              <w:t xml:space="preserve">쉽게 타는 편인지 빨갛게 익는 편인지가 기준입니다</w:t>
             </w:r>
           </w:p>
         </w:tc>
@@ -5244,7 +4820,7 @@
                 <w:sz w:val="20"/>
                 <w:szCs w:val="20"/>
               </w:rPr>
-              <w:t xml:space="preserve">정답: 쿨톤 / 해설: 핑크빛 파운데이션은 쿨톤의 특징이다</w:t>
+              <w:t xml:space="preserve">정답: 쿨톤 / 해설: 빨갛게 익는 피부는 쿨톤의 특징이다</w:t>
             </w:r>
           </w:p>
         </w:tc>
@@ -5300,7 +4876,7 @@
                 <w:sz w:val="20"/>
                 <w:szCs w:val="20"/>
               </w:rPr>
-              <w:t xml:space="preserve">액세서리함 '은색 액세서리만 가득하다' — 어떤 톤?</w:t>
+              <w:t xml:space="preserve">'은빛 계열 장신구가 잘 어울린다' — 어떤 톤?</w:t>
             </w:r>
           </w:p>
         </w:tc>
@@ -5327,7 +4903,7 @@
                 <w:sz w:val="20"/>
                 <w:szCs w:val="20"/>
               </w:rPr>
-              <w:t xml:space="preserve">금색/은색 중 쿨톤에 어울리는 색은?</w:t>
+              <w:t xml:space="preserve">금색과 은색 중 어느 쪽이 쿨톤에 어울릴까요</w:t>
             </w:r>
           </w:p>
         </w:tc>
@@ -5354,7 +4930,7 @@
                 <w:sz w:val="20"/>
                 <w:szCs w:val="20"/>
               </w:rPr>
-              <w:t xml:space="preserve">정답: 쿨톤 / 해설: 은색 선호는 쿨톤의 특징이다</w:t>
+              <w:t xml:space="preserve">정답: 쿨톤 / 해설: 은빛 장신구 선호는 쿨톤의 특징이다</w:t>
             </w:r>
           </w:p>
         </w:tc>
@@ -5408,7 +4984,7 @@
                 <w:sz w:val="20"/>
                 <w:szCs w:val="20"/>
               </w:rPr>
-              <w:t xml:space="preserve">옷장 메모 '주로 남색·회색 옷을 입었다' — 어떤 톤?</w:t>
+              <w:t xml:space="preserve">'핑크 계열 립스틱이 더 잘 어울린다' — 어떤 톤?</w:t>
             </w:r>
           </w:p>
         </w:tc>
@@ -5434,7 +5010,7 @@
                 <w:sz w:val="20"/>
                 <w:szCs w:val="20"/>
               </w:rPr>
-              <w:t xml:space="preserve">남색·회색은 한색 계열입니다. 한색과 어울리는 톤을 떠올려보세요</w:t>
+              <w:t xml:space="preserve">피치 계열과 핑크 계열 중 쿨톤에 어울리는 쪽은?</w:t>
             </w:r>
           </w:p>
         </w:tc>
@@ -5460,7 +5036,7 @@
                 <w:sz w:val="20"/>
                 <w:szCs w:val="20"/>
               </w:rPr>
-              <w:t xml:space="preserve">정답: 쿨톤 / 해설: 한색 계열 선호는 쿨톤과 자연스럽게 연결된다</w:t>
+              <w:t xml:space="preserve">정답: 쿨톤 / 해설: 핑크 계열 립스틱은 쿨톤과 어울린다</w:t>
             </w:r>
           </w:p>
         </w:tc>
@@ -5516,7 +5092,7 @@
                 <w:sz w:val="20"/>
                 <w:szCs w:val="20"/>
               </w:rPr>
-              <w:t xml:space="preserve">손목시계 안쪽 자국 '정맥이 푸르스름하다' — 어떤 톤? + 종합판정</w:t>
+              <w:t xml:space="preserve">'자연광 아래에서 손목 혈관이 파란색으로 보인다' — 어떤 톤? + 종합판정</w:t>
             </w:r>
           </w:p>
         </w:tc>
@@ -5543,7 +5119,7 @@
                 <w:sz w:val="20"/>
                 <w:szCs w:val="20"/>
               </w:rPr>
-              <w:t xml:space="preserve">정맥 색이 푸른빛이면 어떤 톤에 가까울까요?</w:t>
+              <w:t xml:space="preserve">혈관이 초록빛이면 웜톤, 파란빛이면 어떤 톤일까요</w:t>
             </w:r>
           </w:p>
         </w:tc>
@@ -5570,7 +5146,7 @@
                 <w:sz w:val="20"/>
                 <w:szCs w:val="20"/>
               </w:rPr>
-              <w:t xml:space="preserve">정답: 쿨톤 / 종합정답: 쿨톤 / 해설: 네 사람의 단서가 모두 같은 결론을 가리키므로, 서로 다른 정보라도 종합하면 확신을 가지고 답할 수 있다</w:t>
+              <w:t xml:space="preserve">정답: 쿨톤 / 종합정답: 쿨톤 / 해설: 네 사람의 단서(피부 반응·장신구·립스틱·혈관색)가 교과서의 쿨톤 판별 기준과 모두 일치한다</w:t>
             </w:r>
           </w:p>
         </w:tc>
@@ -5582,7 +5158,7 @@
         <w:spacing w:after="150" w:before="300"/>
       </w:pPr>
       <w:r>
-        <w:t xml:space="preserve">4-2. 착시효과 조합 — 체형에 맞추기</w:t>
+        <w:t xml:space="preserve">5-2. 의복 스타일 이미지 매칭 (신규)</w:t>
       </w:r>
     </w:p>
     <w:p>
@@ -5594,7 +5170,233 @@
           <w:sz w:val="21"/>
           <w:szCs w:val="21"/>
         </w:rPr>
-        <w:t xml:space="preserve">사이즈 태그 메모: '163cm, 통통한 편이라 다리가 짧아 보이는 걸 항상 신경 썼다.' (전원 공통으로 확인)</w:t>
+        <w:t xml:space="preserve">퍼스널컬러를 확정하자, 액세서리함 바닥에 붙어 있던 얇은 종이가 눈에 띄었다. 오지수가 평소 다이어리에 즐겨 적던 메모의 한 페이지를 오려 붙여둔 것 같았다.</w:t>
+      </w:r>
+    </w:p>
+    <w:p>
+      <w:pPr>
+        <w:spacing w:after="160" w:line="300"/>
+      </w:pPr>
+      <w:r>
+        <w:rPr>
+          <w:sz w:val="21"/>
+          <w:szCs w:val="21"/>
+        </w:rPr>
+        <w:t xml:space="preserve">오지수의 다이어리 메모: '나는 활동적이고 건강한 느낌을 주는 옷이 좋아. 원색을 즐겨 입고, 기능성 소재도 좋아해. 운동화나 헤어밴드 같은 아이템도 자주 써.'</w:t>
+      </w:r>
+    </w:p>
+    <w:tbl>
+      <w:tblPr>
+        <w:tblW w:type="dxa" w:w="9026"/>
+        <w:tblBorders>
+          <w:top w:val="single" w:color="auto" w:sz="4"/>
+          <w:left w:val="single" w:color="auto" w:sz="4"/>
+          <w:bottom w:val="single" w:color="auto" w:sz="4"/>
+          <w:right w:val="single" w:color="auto" w:sz="4"/>
+          <w:insideH w:val="single" w:color="auto" w:sz="4"/>
+          <w:insideV w:val="single" w:color="auto" w:sz="4"/>
+        </w:tblBorders>
+      </w:tblPr>
+      <w:tblGrid>
+        <w:gridCol w:w="3200"/>
+        <w:gridCol w:w="1400"/>
+        <w:gridCol w:w="4426"/>
+      </w:tblGrid>
+      <w:tr>
+        <w:tc>
+          <w:tcPr>
+            <w:tcW w:type="dxa" w:w="3200"/>
+            <w:shd w:fill="D9E2D0" w:val="clear"/>
+            <w:tcMar>
+              <w:top w:type="dxa" w:w="100"/>
+              <w:left w:type="dxa" w:w="120"/>
+              <w:bottom w:type="dxa" w:w="100"/>
+              <w:right w:type="dxa" w:w="120"/>
+            </w:tcMar>
+            <w:vAlign w:val="center"/>
+          </w:tcPr>
+          <w:p>
+            <w:pPr>
+              <w:jc w:val="left"/>
+            </w:pPr>
+            <w:r>
+              <w:rPr>
+                <w:b/>
+                <w:bCs/>
+                <w:sz w:val="20"/>
+                <w:szCs w:val="20"/>
+              </w:rPr>
+              <w:t xml:space="preserve">문제</w:t>
+            </w:r>
+          </w:p>
+        </w:tc>
+        <w:tc>
+          <w:tcPr>
+            <w:tcW w:type="dxa" w:w="1400"/>
+            <w:shd w:fill="D9E2D0" w:val="clear"/>
+            <w:tcMar>
+              <w:top w:type="dxa" w:w="100"/>
+              <w:left w:type="dxa" w:w="120"/>
+              <w:bottom w:type="dxa" w:w="100"/>
+              <w:right w:type="dxa" w:w="120"/>
+            </w:tcMar>
+            <w:vAlign w:val="center"/>
+          </w:tcPr>
+          <w:p>
+            <w:pPr>
+              <w:jc w:val="left"/>
+            </w:pPr>
+            <w:r>
+              <w:rPr>
+                <w:b/>
+                <w:bCs/>
+                <w:sz w:val="20"/>
+                <w:szCs w:val="20"/>
+              </w:rPr>
+              <w:t xml:space="preserve">정답</w:t>
+            </w:r>
+          </w:p>
+        </w:tc>
+        <w:tc>
+          <w:tcPr>
+            <w:tcW w:type="dxa" w:w="4426"/>
+            <w:shd w:fill="D9E2D0" w:val="clear"/>
+            <w:tcMar>
+              <w:top w:type="dxa" w:w="100"/>
+              <w:left w:type="dxa" w:w="120"/>
+              <w:bottom w:type="dxa" w:w="100"/>
+              <w:right w:type="dxa" w:w="120"/>
+            </w:tcMar>
+            <w:vAlign w:val="center"/>
+          </w:tcPr>
+          <w:p>
+            <w:pPr>
+              <w:jc w:val="left"/>
+            </w:pPr>
+            <w:r>
+              <w:rPr>
+                <w:b/>
+                <w:bCs/>
+                <w:sz w:val="20"/>
+                <w:szCs w:val="20"/>
+              </w:rPr>
+              <w:t xml:space="preserve">해설</w:t>
+            </w:r>
+          </w:p>
+        </w:tc>
+      </w:tr>
+      <w:tr>
+        <w:tc>
+          <w:tcPr>
+            <w:tcW w:type="dxa" w:w="3200"/>
+            <w:tcMar>
+              <w:top w:type="dxa" w:w="100"/>
+              <w:left w:type="dxa" w:w="120"/>
+              <w:bottom w:type="dxa" w:w="100"/>
+              <w:right w:type="dxa" w:w="120"/>
+            </w:tcMar>
+            <w:vAlign w:val="center"/>
+          </w:tcPr>
+          <w:p>
+            <w:pPr>
+              <w:jc w:val="left"/>
+            </w:pPr>
+            <w:r>
+              <w:rPr>
+                <w:b w:val="false"/>
+                <w:bCs w:val="false"/>
+                <w:sz w:val="20"/>
+                <w:szCs w:val="20"/>
+              </w:rPr>
+              <w:t xml:space="preserve">이 메모가 설명하는 의복 스타일 이미지는? (모던·클래식·엘레강스·이그조틱·스포티·캐주얼·아방가르드 중)</w:t>
+            </w:r>
+          </w:p>
+        </w:tc>
+        <w:tc>
+          <w:tcPr>
+            <w:tcW w:type="dxa" w:w="1400"/>
+            <w:tcMar>
+              <w:top w:type="dxa" w:w="100"/>
+              <w:left w:type="dxa" w:w="120"/>
+              <w:bottom w:type="dxa" w:w="100"/>
+              <w:right w:type="dxa" w:w="120"/>
+            </w:tcMar>
+            <w:vAlign w:val="center"/>
+          </w:tcPr>
+          <w:p>
+            <w:pPr>
+              <w:jc w:val="left"/>
+            </w:pPr>
+            <w:r>
+              <w:rPr>
+                <w:b w:val="false"/>
+                <w:bCs w:val="false"/>
+                <w:sz w:val="20"/>
+                <w:szCs w:val="20"/>
+              </w:rPr>
+              <w:t xml:space="preserve">스포티(sporty)</w:t>
+            </w:r>
+          </w:p>
+        </w:tc>
+        <w:tc>
+          <w:tcPr>
+            <w:tcW w:type="dxa" w:w="4426"/>
+            <w:tcMar>
+              <w:top w:type="dxa" w:w="100"/>
+              <w:left w:type="dxa" w:w="120"/>
+              <w:bottom w:type="dxa" w:w="100"/>
+              <w:right w:type="dxa" w:w="120"/>
+            </w:tcMar>
+            <w:vAlign w:val="center"/>
+          </w:tcPr>
+          <w:p>
+            <w:pPr>
+              <w:jc w:val="left"/>
+            </w:pPr>
+            <w:r>
+              <w:rPr>
+                <w:b w:val="false"/>
+                <w:bCs w:val="false"/>
+                <w:sz w:val="20"/>
+                <w:szCs w:val="20"/>
+              </w:rPr>
+              <w:t xml:space="preserve">건강하고 활동적인 패션, 원색 사용, 천연·기능성 소재, 운동화·헤어밴드 등의 아이템은 교과서가 정의한 스포티 이미지의 특징과 정확히 일치한다.</w:t>
+            </w:r>
+          </w:p>
+        </w:tc>
+      </w:tr>
+    </w:tbl>
+    <w:p>
+      <w:pPr>
+        <w:pStyle w:val="Heading2"/>
+        <w:spacing w:after="150" w:before="300"/>
+      </w:pPr>
+      <w:r>
+        <w:t xml:space="preserve">5-3. 착시효과 조합 + 목둘레선</w:t>
+      </w:r>
+    </w:p>
+    <w:p>
+      <w:pPr>
+        <w:spacing w:after="160" w:line="300"/>
+      </w:pPr>
+      <w:r>
+        <w:rPr>
+          <w:sz w:val="21"/>
+          <w:szCs w:val="21"/>
+        </w:rPr>
+        <w:t xml:space="preserve">스타일이 '스포티'라는 것을 알아내자, 옷장 서랍 안쪽에서 사이즈 태그와 작은 손거울이 함께 딸려 나왔다. 거울 뒷면에는 그가 직접 붙여둔 것으로 보이는 메모 두 장이 있었다 — 하나는 체형에 대한 고민, 다른 하나는 얼굴형에 대한 고민이었다.</w:t>
+      </w:r>
+    </w:p>
+    <w:p>
+      <w:pPr>
+        <w:spacing w:after="160" w:line="300"/>
+      </w:pPr>
+      <w:r>
+        <w:rPr>
+          <w:sz w:val="21"/>
+          <w:szCs w:val="21"/>
+        </w:rPr>
+        <w:t xml:space="preserve">사이즈 태그 메모: '163cm, 통통한 편이라 다리가 짧아 보이는 걸 항상 신경 썼다.' 얼굴형 메모: '얼굴이 둥근 편이다.'</w:t>
       </w:r>
     </w:p>
     <w:tbl>
@@ -5882,7 +5684,7 @@
                 <w:sz w:val="20"/>
                 <w:szCs w:val="20"/>
               </w:rPr>
-              <w:t xml:space="preserve">쿨톤(4-1 결과)에 어울리고 수축되어 보이는 색은 난색/한색 중?</w:t>
+              <w:t xml:space="preserve">쿨톤(5-1 결과)에 어울리고 수축되어 보이는 색은 난색/한색 중?</w:t>
             </w:r>
           </w:p>
         </w:tc>
@@ -5990,7 +5792,7 @@
                 <w:sz w:val="20"/>
                 <w:szCs w:val="20"/>
               </w:rPr>
-              <w:t xml:space="preserve">시선이 분산되지 않게 하려면 큰무늬/작은무늬 중?</w:t>
+              <w:t xml:space="preserve">둥근 얼굴형을 갸름하게 보완하는 목둘레선은?</w:t>
             </w:r>
           </w:p>
         </w:tc>
@@ -6016,7 +5818,7 @@
                 <w:sz w:val="20"/>
                 <w:szCs w:val="20"/>
               </w:rPr>
-              <w:t xml:space="preserve">단정한 인상을 주는 무늬 크기를 고르세요</w:t>
+              <w:t xml:space="preserve">교과서 얼굴형별 목둘레선 표를 참고하세요</w:t>
             </w:r>
           </w:p>
         </w:tc>
@@ -6042,7 +5844,7 @@
                 <w:sz w:val="20"/>
                 <w:szCs w:val="20"/>
               </w:rPr>
-              <w:t xml:space="preserve">작은무늬</w:t>
+              <w:t xml:space="preserve">V형 또는 U형 목둘레선</w:t>
             </w:r>
           </w:p>
         </w:tc>
@@ -6171,7 +5973,7 @@
                 <w:sz w:val="20"/>
                 <w:szCs w:val="20"/>
               </w:rPr>
-              <w:t xml:space="preserve">세 사람의 결정(세로선·한색·작은무늬)을 합친 최종 디자인 조합은?</w:t>
+              <w:t xml:space="preserve">세 사람의 결정(세로선·한색·V형 목둘레선)을 합친 최종 스타일링은?</w:t>
             </w:r>
           </w:p>
         </w:tc>
@@ -6197,7 +5999,7 @@
                 <w:sz w:val="20"/>
                 <w:szCs w:val="20"/>
               </w:rPr>
-              <w:t xml:space="preserve">세로선 + 한색 + 작은무늬</w:t>
+              <w:t xml:space="preserve">세로선 + 한색 + V형(U형) 목둘레선</w:t>
             </w:r>
           </w:p>
         </w:tc>
@@ -6223,7 +6025,7 @@
                 <w:sz w:val="20"/>
                 <w:szCs w:val="20"/>
               </w:rPr>
-              <w:t xml:space="preserve">세 요소가 함께 작용해 다리가 길어 보이는 효과를 만든다. 4-1에서 찾은 쿨톤과도 자연스럽게 이어진다.</w:t>
+              <w:t xml:space="preserve">세 요소가 함께 작용해 다리가 길어 보이고 얼굴이 갸름해 보이는 효과를 만든다. 참고: 두껍고 뻣뻣한 재질은 부피감으로 체형이 오히려 부각되어 보이므로, 통통한 체형 보완에는 피하는 것이 좋다(교과서 재질 항목).</w:t>
             </w:r>
           </w:p>
         </w:tc>
@@ -6235,7 +6037,19 @@
         <w:spacing w:after="150" w:before="300"/>
       </w:pPr>
       <w:r>
-        <w:t xml:space="preserve">4-3. 실천적 추론 — 오지수의 마지막 메모</w:t>
+        <w:t xml:space="preserve">5-4. 실천적 추론 — 오지수의 마지막 메모</w:t>
+      </w:r>
+    </w:p>
+    <w:p>
+      <w:pPr>
+        <w:spacing w:after="160" w:line="300"/>
+      </w:pPr>
+      <w:r>
+        <w:rPr>
+          <w:sz w:val="21"/>
+          <w:szCs w:val="21"/>
+        </w:rPr>
+        <w:t xml:space="preserve">완성된 스타일링 카드를 정리해 파일에 끼워 넣으려는 순간, 카드 뒤에 접혀 있던 종이 한 장이 툭 떨어졌다. 병원 진료 확인증이었다 — 오지수가 얼마 전 급하게 피부과에 다녀갔다는 기록과 함께, 그가 남긴 짧은 메모가 붙어 있었다.</w:t>
       </w:r>
     </w:p>
     <w:tbl>
@@ -6479,6 +6293,21 @@
       </w:r>
     </w:p>
     <w:p>
+      <w:pPr>
+        <w:spacing w:after="160" w:line="300"/>
+      </w:pPr>
+      <w:r>
+        <w:rPr>
+          <w:i/>
+          <w:iCs/>
+          <w:color w:val="555555"/>
+          <w:sz w:val="21"/>
+          <w:szCs w:val="21"/>
+        </w:rPr>
+        <w:t xml:space="preserve">두 번째 원단 조각을 손에 쥐자, 스타일링실 안쪽 벽 거울이 스르륵 돌아가며 좁은 통로가 드러났다. 통로 끝에는 먼지 쌓인 금고 하나가 놓여 있었다. 금고 표면에는 낯익은 글씨체로 이렇게 적혀 있었다 — '이 안에 진짜 계획이 있다. 마지막 방으로 가라.'</w:t>
+      </w:r>
+    </w:p>
+    <w:p>
       <w:r>
         <w:br w:type="page"/>
       </w:r>
@@ -6489,16 +6318,7 @@
         <w:spacing w:after="200" w:before="400"/>
       </w:pPr>
       <w:r>
-        <w:t xml:space="preserve">5. 3단계 — TPO+마련계획실: 강태오의 진짜 계획을 막아라</w:t>
-      </w:r>
-    </w:p>
-    <w:p>
-      <w:pPr>
-        <w:pStyle w:val="Heading2"/>
-        <w:spacing w:after="150" w:before="300"/>
-      </w:pPr>
-      <w:r>
-        <w:t xml:space="preserve">5-1. TPO 매칭 — 계획서 속 다섯 벌 점검</w:t>
+        <w:t xml:space="preserve">6. 3단계 — TPO+마련계획실: 강태오의 진짜 계획을 막아라</w:t>
       </w:r>
     </w:p>
     <w:p>
@@ -6510,7 +6330,28 @@
           <w:sz w:val="21"/>
           <w:szCs w:val="21"/>
         </w:rPr>
-        <w:t xml:space="preserve">계획서 속 다섯 상황을 직급별로 나눠 점검한다 (부장이 두 상황 담당).</w:t>
+        <w:t xml:space="preserve">금고를 열자, 마지막 방으로 이어지는 계단이 나타났다. 내려간 곳은 강태오의 개인 서재였다. 책상 위에는 다섯 벌의 옷차림이 스케치된 계획서가 펼쳐져 있었는데, 예복부터 운동복까지 상황별로 대량 생산할 목록이 빼곡히 적혀 있었다. 이걸 그대로 진행한다면, 컬렉션은 진짜가 아니라 강태오의 값싼 복제품으로 채워질 판이었다.</w:t>
+      </w:r>
+    </w:p>
+    <w:p>
+      <w:pPr>
+        <w:pStyle w:val="Heading2"/>
+        <w:spacing w:after="150" w:before="300"/>
+      </w:pPr>
+      <w:r>
+        <w:t xml:space="preserve">6-1. TPO 매칭 — 계획서 속 상황 카드 추리</w:t>
+      </w:r>
+    </w:p>
+    <w:p>
+      <w:pPr>
+        <w:spacing w:after="160" w:line="300"/>
+      </w:pPr>
+      <w:r>
+        <w:rPr>
+          <w:sz w:val="21"/>
+          <w:szCs w:val="21"/>
+        </w:rPr>
+        <w:t xml:space="preserve">계획서 사이에 다섯 개의 상황 카드가 끼워져 있다. 각 카드는 시간·장소·상황을 설명할 뿐 TPO 이름을 직접 알려주지 않는다. 직급별로 카드를 나눠 갖고, 무슨 상황인지 맞혀야 한다 (부장이 두 장 담당).</w:t>
       </w:r>
     </w:p>
     <w:tbl>
@@ -6527,9 +6368,8 @@
       </w:tblPr>
       <w:tblGrid>
         <w:gridCol w:w="1400"/>
-        <w:gridCol w:w="2200"/>
-        <w:gridCol w:w="3226"/>
-        <w:gridCol w:w="2200"/>
+        <w:gridCol w:w="3200"/>
+        <w:gridCol w:w="2426"/>
       </w:tblGrid>
       <w:tr>
         <w:tc>
@@ -6561,7 +6401,7 @@
         </w:tc>
         <w:tc>
           <w:tcPr>
-            <w:tcW w:type="dxa" w:w="2200"/>
+            <w:tcW w:type="dxa" w:w="3200"/>
             <w:shd w:fill="D9E2D0" w:val="clear"/>
             <w:tcMar>
               <w:top w:type="dxa" w:w="100"/>
@@ -6582,13 +6422,13 @@
                 <w:sz w:val="20"/>
                 <w:szCs w:val="20"/>
               </w:rPr>
-              <w:t xml:space="preserve">담당 상황</w:t>
-            </w:r>
-          </w:p>
-        </w:tc>
-        <w:tc>
-          <w:tcPr>
-            <w:tcW w:type="dxa" w:w="3226"/>
+              <w:t xml:space="preserve">상황 카드(문제)</w:t>
+            </w:r>
+          </w:p>
+        </w:tc>
+        <w:tc>
+          <w:tcPr>
+            <w:tcW w:type="dxa" w:w="2426"/>
             <w:shd w:fill="D9E2D0" w:val="clear"/>
             <w:tcMar>
               <w:top w:type="dxa" w:w="100"/>
@@ -6609,13 +6449,358 @@
                 <w:sz w:val="20"/>
                 <w:szCs w:val="20"/>
               </w:rPr>
-              <w:t xml:space="preserve">조건(힌트)</w:t>
-            </w:r>
-          </w:p>
-        </w:tc>
-        <w:tc>
-          <w:tcPr>
-            <w:tcW w:type="dxa" w:w="2200"/>
+              <w:t xml:space="preserve">정답 / 해설</w:t>
+            </w:r>
+          </w:p>
+        </w:tc>
+      </w:tr>
+      <w:tr>
+        <w:tc>
+          <w:tcPr>
+            <w:tcW w:type="dxa" w:w="1400"/>
+            <w:tcMar>
+              <w:top w:type="dxa" w:w="100"/>
+              <w:left w:type="dxa" w:w="120"/>
+              <w:bottom w:type="dxa" w:w="100"/>
+              <w:right w:type="dxa" w:w="120"/>
+            </w:tcMar>
+            <w:vAlign w:val="center"/>
+          </w:tcPr>
+          <w:p>
+            <w:pPr>
+              <w:jc w:val="left"/>
+            </w:pPr>
+            <w:r>
+              <w:rPr>
+                <w:b w:val="false"/>
+                <w:bCs w:val="false"/>
+                <w:sz w:val="20"/>
+                <w:szCs w:val="20"/>
+              </w:rPr>
+              <w:t xml:space="preserve">인턴</w:t>
+            </w:r>
+          </w:p>
+        </w:tc>
+        <w:tc>
+          <w:tcPr>
+            <w:tcW w:type="dxa" w:w="3200"/>
+            <w:tcMar>
+              <w:top w:type="dxa" w:w="100"/>
+              <w:left w:type="dxa" w:w="120"/>
+              <w:bottom w:type="dxa" w:w="100"/>
+              <w:right w:type="dxa" w:w="120"/>
+            </w:tcMar>
+            <w:vAlign w:val="center"/>
+          </w:tcPr>
+          <w:p>
+            <w:pPr>
+              <w:jc w:val="left"/>
+            </w:pPr>
+            <w:r>
+              <w:rPr>
+                <w:b w:val="false"/>
+                <w:bCs w:val="false"/>
+                <w:sz w:val="20"/>
+                <w:szCs w:val="20"/>
+              </w:rPr>
+              <w:t xml:space="preserve">'저녁 8시, 학교 강당에서 열리는 졸업식에 하객으로 참석한다.' 이 상황에 맞는 옷차림은?</w:t>
+            </w:r>
+          </w:p>
+        </w:tc>
+        <w:tc>
+          <w:tcPr>
+            <w:tcW w:type="dxa" w:w="2426"/>
+            <w:tcMar>
+              <w:top w:type="dxa" w:w="100"/>
+              <w:left w:type="dxa" w:w="120"/>
+              <w:bottom w:type="dxa" w:w="100"/>
+              <w:right w:type="dxa" w:w="120"/>
+            </w:tcMar>
+            <w:vAlign w:val="center"/>
+          </w:tcPr>
+          <w:p>
+            <w:pPr>
+              <w:jc w:val="left"/>
+            </w:pPr>
+            <w:r>
+              <w:rPr>
+                <w:b w:val="false"/>
+                <w:bCs w:val="false"/>
+                <w:sz w:val="20"/>
+                <w:szCs w:val="20"/>
+              </w:rPr>
+              <w:t xml:space="preserve">정답: 예복 / 해설: 행사에 참석할 때는 정장이나 예복 등 예의를 갖춘 옷차림을 한다</w:t>
+            </w:r>
+          </w:p>
+        </w:tc>
+      </w:tr>
+      <w:tr>
+        <w:tc>
+          <w:tcPr>
+            <w:tcW w:type="dxa" w:w="1400"/>
+            <w:shd w:fill="F5F7F3" w:val="clear"/>
+            <w:tcMar>
+              <w:top w:type="dxa" w:w="100"/>
+              <w:left w:type="dxa" w:w="120"/>
+              <w:bottom w:type="dxa" w:w="100"/>
+              <w:right w:type="dxa" w:w="120"/>
+            </w:tcMar>
+            <w:vAlign w:val="center"/>
+          </w:tcPr>
+          <w:p>
+            <w:pPr>
+              <w:jc w:val="left"/>
+            </w:pPr>
+            <w:r>
+              <w:rPr>
+                <w:b w:val="false"/>
+                <w:bCs w:val="false"/>
+                <w:sz w:val="20"/>
+                <w:szCs w:val="20"/>
+              </w:rPr>
+              <w:t xml:space="preserve">사원</w:t>
+            </w:r>
+          </w:p>
+        </w:tc>
+        <w:tc>
+          <w:tcPr>
+            <w:tcW w:type="dxa" w:w="3200"/>
+            <w:shd w:fill="F5F7F3" w:val="clear"/>
+            <w:tcMar>
+              <w:top w:type="dxa" w:w="100"/>
+              <w:left w:type="dxa" w:w="120"/>
+              <w:bottom w:type="dxa" w:w="100"/>
+              <w:right w:type="dxa" w:w="120"/>
+            </w:tcMar>
+            <w:vAlign w:val="center"/>
+          </w:tcPr>
+          <w:p>
+            <w:pPr>
+              <w:jc w:val="left"/>
+            </w:pPr>
+            <w:r>
+              <w:rPr>
+                <w:b w:val="false"/>
+                <w:bCs w:val="false"/>
+                <w:sz w:val="20"/>
+                <w:szCs w:val="20"/>
+              </w:rPr>
+              <w:t xml:space="preserve">'주말 오후, 친구와 시내에서 쇼핑하며 논다.' 이 상황에 맞는 옷차림은?</w:t>
+            </w:r>
+          </w:p>
+        </w:tc>
+        <w:tc>
+          <w:tcPr>
+            <w:tcW w:type="dxa" w:w="2426"/>
+            <w:shd w:fill="F5F7F3" w:val="clear"/>
+            <w:tcMar>
+              <w:top w:type="dxa" w:w="100"/>
+              <w:left w:type="dxa" w:w="120"/>
+              <w:bottom w:type="dxa" w:w="100"/>
+              <w:right w:type="dxa" w:w="120"/>
+            </w:tcMar>
+            <w:vAlign w:val="center"/>
+          </w:tcPr>
+          <w:p>
+            <w:pPr>
+              <w:jc w:val="left"/>
+            </w:pPr>
+            <w:r>
+              <w:rPr>
+                <w:b w:val="false"/>
+                <w:bCs w:val="false"/>
+                <w:sz w:val="20"/>
+                <w:szCs w:val="20"/>
+              </w:rPr>
+              <w:t xml:space="preserve">정답: 외출복 / 해설: 개성 있으면서도 무난하게 단정한 디자인이 어울린다</w:t>
+            </w:r>
+          </w:p>
+        </w:tc>
+      </w:tr>
+      <w:tr>
+        <w:tc>
+          <w:tcPr>
+            <w:tcW w:type="dxa" w:w="1400"/>
+            <w:tcMar>
+              <w:top w:type="dxa" w:w="100"/>
+              <w:left w:type="dxa" w:w="120"/>
+              <w:bottom w:type="dxa" w:w="100"/>
+              <w:right w:type="dxa" w:w="120"/>
+            </w:tcMar>
+            <w:vAlign w:val="center"/>
+          </w:tcPr>
+          <w:p>
+            <w:pPr>
+              <w:jc w:val="left"/>
+            </w:pPr>
+            <w:r>
+              <w:rPr>
+                <w:b w:val="false"/>
+                <w:bCs w:val="false"/>
+                <w:sz w:val="20"/>
+                <w:szCs w:val="20"/>
+              </w:rPr>
+              <w:t xml:space="preserve">차장</w:t>
+            </w:r>
+          </w:p>
+        </w:tc>
+        <w:tc>
+          <w:tcPr>
+            <w:tcW w:type="dxa" w:w="3200"/>
+            <w:tcMar>
+              <w:top w:type="dxa" w:w="100"/>
+              <w:left w:type="dxa" w:w="120"/>
+              <w:bottom w:type="dxa" w:w="100"/>
+              <w:right w:type="dxa" w:w="120"/>
+            </w:tcMar>
+            <w:vAlign w:val="center"/>
+          </w:tcPr>
+          <w:p>
+            <w:pPr>
+              <w:jc w:val="left"/>
+            </w:pPr>
+            <w:r>
+              <w:rPr>
+                <w:b w:val="false"/>
+                <w:bCs w:val="false"/>
+                <w:sz w:val="20"/>
+                <w:szCs w:val="20"/>
+              </w:rPr>
+              <w:t xml:space="preserve">'토요일 아침, 근처 산으로 등산을 간다.' 이 상황에 맞는 옷차림은?</w:t>
+            </w:r>
+          </w:p>
+        </w:tc>
+        <w:tc>
+          <w:tcPr>
+            <w:tcW w:type="dxa" w:w="2426"/>
+            <w:tcMar>
+              <w:top w:type="dxa" w:w="100"/>
+              <w:left w:type="dxa" w:w="120"/>
+              <w:bottom w:type="dxa" w:w="100"/>
+              <w:right w:type="dxa" w:w="120"/>
+            </w:tcMar>
+            <w:vAlign w:val="center"/>
+          </w:tcPr>
+          <w:p>
+            <w:pPr>
+              <w:jc w:val="left"/>
+            </w:pPr>
+            <w:r>
+              <w:rPr>
+                <w:b w:val="false"/>
+                <w:bCs w:val="false"/>
+                <w:sz w:val="20"/>
+                <w:szCs w:val="20"/>
+              </w:rPr>
+              <w:t xml:space="preserve">정답: 운동복 / 해설: 안전과 활동성을 고려해 신축성 좋은 기능성 소재를 선택한다</w:t>
+            </w:r>
+          </w:p>
+        </w:tc>
+      </w:tr>
+      <w:tr>
+        <w:tc>
+          <w:tcPr>
+            <w:tcW w:type="dxa" w:w="1400"/>
+            <w:shd w:fill="F5F7F3" w:val="clear"/>
+            <w:tcMar>
+              <w:top w:type="dxa" w:w="100"/>
+              <w:left w:type="dxa" w:w="120"/>
+              <w:bottom w:type="dxa" w:w="100"/>
+              <w:right w:type="dxa" w:w="120"/>
+            </w:tcMar>
+            <w:vAlign w:val="center"/>
+          </w:tcPr>
+          <w:p>
+            <w:pPr>
+              <w:jc w:val="left"/>
+            </w:pPr>
+            <w:r>
+              <w:rPr>
+                <w:b w:val="false"/>
+                <w:bCs w:val="false"/>
+                <w:sz w:val="20"/>
+                <w:szCs w:val="20"/>
+              </w:rPr>
+              <w:t xml:space="preserve">부장</w:t>
+            </w:r>
+          </w:p>
+        </w:tc>
+        <w:tc>
+          <w:tcPr>
+            <w:tcW w:type="dxa" w:w="3200"/>
+            <w:shd w:fill="F5F7F3" w:val="clear"/>
+            <w:tcMar>
+              <w:top w:type="dxa" w:w="100"/>
+              <w:left w:type="dxa" w:w="120"/>
+              <w:bottom w:type="dxa" w:w="100"/>
+              <w:right w:type="dxa" w:w="120"/>
+            </w:tcMar>
+            <w:vAlign w:val="center"/>
+          </w:tcPr>
+          <w:p>
+            <w:pPr>
+              <w:jc w:val="left"/>
+            </w:pPr>
+            <w:r>
+              <w:rPr>
+                <w:b w:val="false"/>
+                <w:bCs w:val="false"/>
+                <w:sz w:val="20"/>
+                <w:szCs w:val="20"/>
+              </w:rPr>
+              <w:t xml:space="preserve">'평일 저녁, 집에서 편하게 쉰다' / '요리사가 되어 주방에서 하루 종일 일한다.' 두 상황에 각각 맞는 옷차림은? + 종합판정</w:t>
+            </w:r>
+          </w:p>
+        </w:tc>
+        <w:tc>
+          <w:tcPr>
+            <w:tcW w:type="dxa" w:w="2426"/>
+            <w:shd w:fill="F5F7F3" w:val="clear"/>
+            <w:tcMar>
+              <w:top w:type="dxa" w:w="100"/>
+              <w:left w:type="dxa" w:w="120"/>
+              <w:bottom w:type="dxa" w:w="100"/>
+              <w:right w:type="dxa" w:w="120"/>
+            </w:tcMar>
+            <w:vAlign w:val="center"/>
+          </w:tcPr>
+          <w:p>
+            <w:pPr>
+              <w:jc w:val="left"/>
+            </w:pPr>
+            <w:r>
+              <w:rPr>
+                <w:b w:val="false"/>
+                <w:bCs w:val="false"/>
+                <w:sz w:val="20"/>
+                <w:szCs w:val="20"/>
+              </w:rPr>
+              <w:t xml:space="preserve">정답: 평상복 / 작업복 / 종합문제는 아래 참고</w:t>
+            </w:r>
+          </w:p>
+        </w:tc>
+      </w:tr>
+    </w:tbl>
+    <w:tbl>
+      <w:tblPr>
+        <w:tblW w:type="dxa" w:w="9026"/>
+        <w:tblBorders>
+          <w:top w:val="single" w:color="auto" w:sz="4"/>
+          <w:left w:val="single" w:color="auto" w:sz="4"/>
+          <w:bottom w:val="single" w:color="auto" w:sz="4"/>
+          <w:right w:val="single" w:color="auto" w:sz="4"/>
+          <w:insideH w:val="single" w:color="auto" w:sz="4"/>
+          <w:insideV w:val="single" w:color="auto" w:sz="4"/>
+        </w:tblBorders>
+      </w:tblPr>
+      <w:tblGrid>
+        <w:gridCol w:w="3200"/>
+        <w:gridCol w:w="5826"/>
+      </w:tblGrid>
+      <w:tr>
+        <w:tc>
+          <w:tcPr>
+            <w:tcW w:type="dxa" w:w="3200"/>
             <w:shd w:fill="D9E2D0" w:val="clear"/>
             <w:tcMar>
               <w:top w:type="dxa" w:w="100"/>
@@ -6636,6 +6821,33 @@
                 <w:sz w:val="20"/>
                 <w:szCs w:val="20"/>
               </w:rPr>
+              <w:t xml:space="preserve">부장 종합 문제</w:t>
+            </w:r>
+          </w:p>
+        </w:tc>
+        <w:tc>
+          <w:tcPr>
+            <w:tcW w:type="dxa" w:w="5826"/>
+            <w:shd w:fill="D9E2D0" w:val="clear"/>
+            <w:tcMar>
+              <w:top w:type="dxa" w:w="100"/>
+              <w:left w:type="dxa" w:w="120"/>
+              <w:bottom w:type="dxa" w:w="100"/>
+              <w:right w:type="dxa" w:w="120"/>
+            </w:tcMar>
+            <w:vAlign w:val="center"/>
+          </w:tcPr>
+          <w:p>
+            <w:pPr>
+              <w:jc w:val="left"/>
+            </w:pPr>
+            <w:r>
+              <w:rPr>
+                <w:b/>
+                <w:bCs/>
+                <w:sz w:val="20"/>
+                <w:szCs w:val="20"/>
+              </w:rPr>
               <w:t xml:space="preserve">판정 방법</w:t>
             </w:r>
           </w:p>
@@ -6644,431 +6856,53 @@
       <w:tr>
         <w:tc>
           <w:tcPr>
-            <w:tcW w:type="dxa" w:w="1400"/>
-            <w:tcMar>
-              <w:top w:type="dxa" w:w="100"/>
-              <w:left w:type="dxa" w:w="120"/>
-              <w:bottom w:type="dxa" w:w="100"/>
-              <w:right w:type="dxa" w:w="120"/>
-            </w:tcMar>
-            <w:vAlign w:val="center"/>
-          </w:tcPr>
-          <w:p>
-            <w:pPr>
-              <w:jc w:val="left"/>
-            </w:pPr>
-            <w:r>
-              <w:rPr>
-                <w:b w:val="false"/>
-                <w:bCs w:val="false"/>
-                <w:sz w:val="20"/>
-                <w:szCs w:val="20"/>
-              </w:rPr>
-              <w:t xml:space="preserve">인턴</w:t>
-            </w:r>
-          </w:p>
-        </w:tc>
-        <w:tc>
-          <w:tcPr>
-            <w:tcW w:type="dxa" w:w="2200"/>
-            <w:tcMar>
-              <w:top w:type="dxa" w:w="100"/>
-              <w:left w:type="dxa" w:w="120"/>
-              <w:bottom w:type="dxa" w:w="100"/>
-              <w:right w:type="dxa" w:w="120"/>
-            </w:tcMar>
-            <w:vAlign w:val="center"/>
-          </w:tcPr>
-          <w:p>
-            <w:pPr>
-              <w:jc w:val="left"/>
-            </w:pPr>
-            <w:r>
-              <w:rPr>
-                <w:b w:val="false"/>
-                <w:bCs w:val="false"/>
-                <w:sz w:val="20"/>
-                <w:szCs w:val="20"/>
-              </w:rPr>
-              <w:t xml:space="preserve">평상복</w:t>
-            </w:r>
-          </w:p>
-        </w:tc>
-        <w:tc>
-          <w:tcPr>
-            <w:tcW w:type="dxa" w:w="3226"/>
-            <w:tcMar>
-              <w:top w:type="dxa" w:w="100"/>
-              <w:left w:type="dxa" w:w="120"/>
-              <w:bottom w:type="dxa" w:w="100"/>
-              <w:right w:type="dxa" w:w="120"/>
-            </w:tcMar>
-            <w:vAlign w:val="center"/>
-          </w:tcPr>
-          <w:p>
-            <w:pPr>
-              <w:jc w:val="left"/>
-            </w:pPr>
-            <w:r>
-              <w:rPr>
-                <w:b w:val="false"/>
-                <w:bCs w:val="false"/>
-                <w:sz w:val="20"/>
-                <w:szCs w:val="20"/>
-              </w:rPr>
-              <w:t xml:space="preserve">편안한 재질, 자유로운 색·무늬 조합</w:t>
-            </w:r>
-          </w:p>
-        </w:tc>
-        <w:tc>
-          <w:tcPr>
-            <w:tcW w:type="dxa" w:w="2200"/>
-            <w:tcMar>
-              <w:top w:type="dxa" w:w="100"/>
-              <w:left w:type="dxa" w:w="120"/>
-              <w:bottom w:type="dxa" w:w="100"/>
-              <w:right w:type="dxa" w:w="120"/>
-            </w:tcMar>
-            <w:vAlign w:val="center"/>
-          </w:tcPr>
-          <w:p>
-            <w:pPr>
-              <w:jc w:val="left"/>
-            </w:pPr>
-            <w:r>
-              <w:rPr>
-                <w:b w:val="false"/>
-                <w:bCs w:val="false"/>
-                <w:sz w:val="20"/>
-                <w:szCs w:val="20"/>
-              </w:rPr>
-              <w:t xml:space="preserve">1·2단계 디자인과 대조</w:t>
-            </w:r>
-          </w:p>
-        </w:tc>
-      </w:tr>
-      <w:tr>
-        <w:tc>
-          <w:tcPr>
-            <w:tcW w:type="dxa" w:w="1400"/>
-            <w:shd w:fill="F5F7F3" w:val="clear"/>
-            <w:tcMar>
-              <w:top w:type="dxa" w:w="100"/>
-              <w:left w:type="dxa" w:w="120"/>
-              <w:bottom w:type="dxa" w:w="100"/>
-              <w:right w:type="dxa" w:w="120"/>
-            </w:tcMar>
-            <w:vAlign w:val="center"/>
-          </w:tcPr>
-          <w:p>
-            <w:pPr>
-              <w:jc w:val="left"/>
-            </w:pPr>
-            <w:r>
-              <w:rPr>
-                <w:b w:val="false"/>
-                <w:bCs w:val="false"/>
-                <w:sz w:val="20"/>
-                <w:szCs w:val="20"/>
-              </w:rPr>
-              <w:t xml:space="preserve">사원</w:t>
-            </w:r>
-          </w:p>
-        </w:tc>
-        <w:tc>
-          <w:tcPr>
-            <w:tcW w:type="dxa" w:w="2200"/>
-            <w:shd w:fill="F5F7F3" w:val="clear"/>
-            <w:tcMar>
-              <w:top w:type="dxa" w:w="100"/>
-              <w:left w:type="dxa" w:w="120"/>
-              <w:bottom w:type="dxa" w:w="100"/>
-              <w:right w:type="dxa" w:w="120"/>
-            </w:tcMar>
-            <w:vAlign w:val="center"/>
-          </w:tcPr>
-          <w:p>
-            <w:pPr>
-              <w:jc w:val="left"/>
-            </w:pPr>
-            <w:r>
-              <w:rPr>
-                <w:b w:val="false"/>
-                <w:bCs w:val="false"/>
-                <w:sz w:val="20"/>
-                <w:szCs w:val="20"/>
-              </w:rPr>
-              <w:t xml:space="preserve">외출복</w:t>
-            </w:r>
-          </w:p>
-        </w:tc>
-        <w:tc>
-          <w:tcPr>
-            <w:tcW w:type="dxa" w:w="3226"/>
-            <w:shd w:fill="F5F7F3" w:val="clear"/>
-            <w:tcMar>
-              <w:top w:type="dxa" w:w="100"/>
-              <w:left w:type="dxa" w:w="120"/>
-              <w:bottom w:type="dxa" w:w="100"/>
-              <w:right w:type="dxa" w:w="120"/>
-            </w:tcMar>
-            <w:vAlign w:val="center"/>
-          </w:tcPr>
-          <w:p>
-            <w:pPr>
-              <w:jc w:val="left"/>
-            </w:pPr>
-            <w:r>
-              <w:rPr>
-                <w:b w:val="false"/>
-                <w:bCs w:val="false"/>
-                <w:sz w:val="20"/>
-                <w:szCs w:val="20"/>
-              </w:rPr>
-              <w:t xml:space="preserve">개성 있는 디자인, TPO상 무난한 단정함</w:t>
-            </w:r>
-          </w:p>
-        </w:tc>
-        <w:tc>
-          <w:tcPr>
-            <w:tcW w:type="dxa" w:w="2200"/>
-            <w:shd w:fill="F5F7F3" w:val="clear"/>
-            <w:tcMar>
-              <w:top w:type="dxa" w:w="100"/>
-              <w:left w:type="dxa" w:w="120"/>
-              <w:bottom w:type="dxa" w:w="100"/>
-              <w:right w:type="dxa" w:w="120"/>
-            </w:tcMar>
-            <w:vAlign w:val="center"/>
-          </w:tcPr>
-          <w:p>
-            <w:pPr>
-              <w:jc w:val="left"/>
-            </w:pPr>
-            <w:r>
-              <w:rPr>
-                <w:b w:val="false"/>
-                <w:bCs w:val="false"/>
-                <w:sz w:val="20"/>
-                <w:szCs w:val="20"/>
-              </w:rPr>
-              <w:t xml:space="preserve">1·2단계 디자인과 대조</w:t>
-            </w:r>
-          </w:p>
-        </w:tc>
-      </w:tr>
-      <w:tr>
-        <w:tc>
-          <w:tcPr>
-            <w:tcW w:type="dxa" w:w="1400"/>
-            <w:tcMar>
-              <w:top w:type="dxa" w:w="100"/>
-              <w:left w:type="dxa" w:w="120"/>
-              <w:bottom w:type="dxa" w:w="100"/>
-              <w:right w:type="dxa" w:w="120"/>
-            </w:tcMar>
-            <w:vAlign w:val="center"/>
-          </w:tcPr>
-          <w:p>
-            <w:pPr>
-              <w:jc w:val="left"/>
-            </w:pPr>
-            <w:r>
-              <w:rPr>
-                <w:b w:val="false"/>
-                <w:bCs w:val="false"/>
-                <w:sz w:val="20"/>
-                <w:szCs w:val="20"/>
-              </w:rPr>
-              <w:t xml:space="preserve">차장</w:t>
-            </w:r>
-          </w:p>
-        </w:tc>
-        <w:tc>
-          <w:tcPr>
-            <w:tcW w:type="dxa" w:w="2200"/>
-            <w:tcMar>
-              <w:top w:type="dxa" w:w="100"/>
-              <w:left w:type="dxa" w:w="120"/>
-              <w:bottom w:type="dxa" w:w="100"/>
-              <w:right w:type="dxa" w:w="120"/>
-            </w:tcMar>
-            <w:vAlign w:val="center"/>
-          </w:tcPr>
-          <w:p>
-            <w:pPr>
-              <w:jc w:val="left"/>
-            </w:pPr>
-            <w:r>
-              <w:rPr>
-                <w:b w:val="false"/>
-                <w:bCs w:val="false"/>
-                <w:sz w:val="20"/>
-                <w:szCs w:val="20"/>
-              </w:rPr>
-              <w:t xml:space="preserve">운동복(등산)</w:t>
-            </w:r>
-          </w:p>
-        </w:tc>
-        <w:tc>
-          <w:tcPr>
-            <w:tcW w:type="dxa" w:w="3226"/>
-            <w:tcMar>
-              <w:top w:type="dxa" w:w="100"/>
-              <w:left w:type="dxa" w:w="120"/>
-              <w:bottom w:type="dxa" w:w="100"/>
-              <w:right w:type="dxa" w:w="120"/>
-            </w:tcMar>
-            <w:vAlign w:val="center"/>
-          </w:tcPr>
-          <w:p>
-            <w:pPr>
-              <w:jc w:val="left"/>
-            </w:pPr>
-            <w:r>
-              <w:rPr>
-                <w:b w:val="false"/>
-                <w:bCs w:val="false"/>
-                <w:sz w:val="20"/>
-                <w:szCs w:val="20"/>
-              </w:rPr>
-              <w:t xml:space="preserve">신축성 좋은 재질, 기능성 소재</w:t>
-            </w:r>
-          </w:p>
-        </w:tc>
-        <w:tc>
-          <w:tcPr>
-            <w:tcW w:type="dxa" w:w="2200"/>
-            <w:tcMar>
-              <w:top w:type="dxa" w:w="100"/>
-              <w:left w:type="dxa" w:w="120"/>
-              <w:bottom w:type="dxa" w:w="100"/>
-              <w:right w:type="dxa" w:w="120"/>
-            </w:tcMar>
-            <w:vAlign w:val="center"/>
-          </w:tcPr>
-          <w:p>
-            <w:pPr>
-              <w:jc w:val="left"/>
-            </w:pPr>
-            <w:r>
-              <w:rPr>
-                <w:b w:val="false"/>
-                <w:bCs w:val="false"/>
-                <w:sz w:val="20"/>
-                <w:szCs w:val="20"/>
-              </w:rPr>
-              <w:t xml:space="preserve">1·2단계 디자인과 대조</w:t>
-            </w:r>
-          </w:p>
-        </w:tc>
-      </w:tr>
-      <w:tr>
-        <w:tc>
-          <w:tcPr>
-            <w:tcW w:type="dxa" w:w="1400"/>
-            <w:shd w:fill="F5F7F3" w:val="clear"/>
-            <w:tcMar>
-              <w:top w:type="dxa" w:w="100"/>
-              <w:left w:type="dxa" w:w="120"/>
-              <w:bottom w:type="dxa" w:w="100"/>
-              <w:right w:type="dxa" w:w="120"/>
-            </w:tcMar>
-            <w:vAlign w:val="center"/>
-          </w:tcPr>
-          <w:p>
-            <w:pPr>
-              <w:jc w:val="left"/>
-            </w:pPr>
-            <w:r>
-              <w:rPr>
-                <w:b w:val="false"/>
-                <w:bCs w:val="false"/>
-                <w:sz w:val="20"/>
-                <w:szCs w:val="20"/>
-              </w:rPr>
-              <w:t xml:space="preserve">부장</w:t>
-            </w:r>
-          </w:p>
-        </w:tc>
-        <w:tc>
-          <w:tcPr>
-            <w:tcW w:type="dxa" w:w="2200"/>
-            <w:shd w:fill="F5F7F3" w:val="clear"/>
-            <w:tcMar>
-              <w:top w:type="dxa" w:w="100"/>
-              <w:left w:type="dxa" w:w="120"/>
-              <w:bottom w:type="dxa" w:w="100"/>
-              <w:right w:type="dxa" w:w="120"/>
-            </w:tcMar>
-            <w:vAlign w:val="center"/>
-          </w:tcPr>
-          <w:p>
-            <w:pPr>
-              <w:jc w:val="left"/>
-            </w:pPr>
-            <w:r>
-              <w:rPr>
-                <w:b w:val="false"/>
-                <w:bCs w:val="false"/>
-                <w:sz w:val="20"/>
-                <w:szCs w:val="20"/>
-              </w:rPr>
-              <w:t xml:space="preserve">예복·작업복 + 종합</w:t>
-            </w:r>
-          </w:p>
-        </w:tc>
-        <w:tc>
-          <w:tcPr>
-            <w:tcW w:type="dxa" w:w="3226"/>
-            <w:shd w:fill="F5F7F3" w:val="clear"/>
-            <w:tcMar>
-              <w:top w:type="dxa" w:w="100"/>
-              <w:left w:type="dxa" w:w="120"/>
-              <w:bottom w:type="dxa" w:w="100"/>
-              <w:right w:type="dxa" w:w="120"/>
-            </w:tcMar>
-            <w:vAlign w:val="center"/>
-          </w:tcPr>
-          <w:p>
-            <w:pPr>
-              <w:jc w:val="left"/>
-            </w:pPr>
-            <w:r>
-              <w:rPr>
-                <w:b w:val="false"/>
-                <w:bCs w:val="false"/>
-                <w:sz w:val="20"/>
-                <w:szCs w:val="20"/>
-              </w:rPr>
-              <w:t xml:space="preserve">예복: 단정한 라인·격식 있는 재질 / 작업복: 활동성 좋은 재질·오염이 잘 보이지 않는 색</w:t>
-            </w:r>
-          </w:p>
-        </w:tc>
-        <w:tc>
-          <w:tcPr>
-            <w:tcW w:type="dxa" w:w="2200"/>
-            <w:shd w:fill="F5F7F3" w:val="clear"/>
-            <w:tcMar>
-              <w:top w:type="dxa" w:w="100"/>
-              <w:left w:type="dxa" w:w="120"/>
-              <w:bottom w:type="dxa" w:w="100"/>
-              <w:right w:type="dxa" w:w="120"/>
-            </w:tcMar>
-            <w:vAlign w:val="center"/>
-          </w:tcPr>
-          <w:p>
-            <w:pPr>
-              <w:jc w:val="left"/>
-            </w:pPr>
-            <w:r>
-              <w:rPr>
-                <w:b w:val="false"/>
-                <w:bCs w:val="false"/>
-                <w:sz w:val="20"/>
-                <w:szCs w:val="20"/>
-              </w:rPr>
-              <w:t xml:space="preserve">네 사람의 판정을 모아 컬렉션이 가장 적합한 TPO 하나를 최종 선택</w:t>
+            <w:tcW w:type="dxa" w:w="3200"/>
+            <w:tcMar>
+              <w:top w:type="dxa" w:w="100"/>
+              <w:left w:type="dxa" w:w="120"/>
+              <w:bottom w:type="dxa" w:w="100"/>
+              <w:right w:type="dxa" w:w="120"/>
+            </w:tcMar>
+            <w:vAlign w:val="center"/>
+          </w:tcPr>
+          <w:p>
+            <w:pPr>
+              <w:jc w:val="left"/>
+            </w:pPr>
+            <w:r>
+              <w:rPr>
+                <w:b w:val="false"/>
+                <w:bCs w:val="false"/>
+                <w:sz w:val="20"/>
+                <w:szCs w:val="20"/>
+              </w:rPr>
+              <w:t xml:space="preserve">우리 팀이 1·2단계에서 완성한 디자인(선·색·재질·무늬 조합)은 다섯 상황(예복·외출복·운동복·평상복·작업복) 중 어디에 가장 잘 맞는가? 각 상황의 조건표와 우리 디자인을 대조해 하나를 골라 제출한다.</w:t>
+            </w:r>
+          </w:p>
+        </w:tc>
+        <w:tc>
+          <w:tcPr>
+            <w:tcW w:type="dxa" w:w="5826"/>
+            <w:tcMar>
+              <w:top w:type="dxa" w:w="100"/>
+              <w:left w:type="dxa" w:w="120"/>
+              <w:bottom w:type="dxa" w:w="100"/>
+              <w:right w:type="dxa" w:w="120"/>
+            </w:tcMar>
+            <w:vAlign w:val="center"/>
+          </w:tcPr>
+          <w:p>
+            <w:pPr>
+              <w:jc w:val="left"/>
+            </w:pPr>
+            <w:r>
+              <w:rPr>
+                <w:b w:val="false"/>
+                <w:bCs w:val="false"/>
+                <w:sz w:val="20"/>
+                <w:szCs w:val="20"/>
+              </w:rPr>
+              <w:t xml:space="preserve">예복: 단정한 라인·격식 있는 재질 / 외출복: 개성 있으면서 무난한 단정함 / 운동복: 신축성 좋은 기능성 소재 / 평상복: 편안한 재질·자유로운 색·무늬 / 작업복: 활동성 좋은 재질·오염이 잘 보이지 않는 색</w:t>
             </w:r>
           </w:p>
         </w:tc>
@@ -7083,7 +6917,7 @@
           <w:sz w:val="21"/>
           <w:szCs w:val="21"/>
         </w:rPr>
-        <w:t xml:space="preserve">완성 컬렉션은 팀마다 다르므로 고정 정답은 없다. 웹앱이 1·2단계에서 고른 디자인 요소와 각 조건을 자동 대조해 충족 여부를 표시하고, 부장이 그 결과를 종합해 최종 TPO를 제출한다.</w:t>
+        <w:t xml:space="preserve">앞의 다섯 문제(상황→TPO 이름 맞히기)는 정답이 정해져 있고, 마지막 부장 종합 문제만 팀의 디자인에 따라 답이 달라진다. 인턴·사원·차장·부장 각자의 상황 카드 정답을 모두 맞혀야 부장의 종합 제출 버튼이 열린다.</w:t>
       </w:r>
     </w:p>
     <w:p>
@@ -7092,7 +6926,7 @@
         <w:spacing w:after="150" w:before="300"/>
       </w:pPr>
       <w:r>
-        <w:t xml:space="preserve">5-2. 진짜 계획서 복원 — 5R 순서</w:t>
+        <w:t xml:space="preserve">6-2. 진짜 계획서 복원 — 5R 순서 (용어 정정)</w:t>
       </w:r>
     </w:p>
     <w:p>
@@ -7104,7 +6938,19 @@
           <w:sz w:val="21"/>
           <w:szCs w:val="21"/>
         </w:rPr>
-        <w:t xml:space="preserve">금고 옆, 찢어진 한서연의 진짜 계획서 조각을 직급별로 나눠 확인한다.</w:t>
+        <w:t xml:space="preserve">TPO를 확정하자 책상 서랍의 다이얼 자물쇠 중 하나가 '딸깍' 소리를 내며 풀렸다. 나머지를 열려면 서랍 옆 바닥에 흩어진 종잇조각들을 맞춰야 했다 — 누군가 급하게 찢어버린 흔적이었다. 자세히 보니 한서연의 필체였다. 그는 이곳에서 강태오와 마주쳤던 것이 분명했다.</w:t>
+      </w:r>
+    </w:p>
+    <w:p>
+      <w:pPr>
+        <w:spacing w:after="160" w:line="300"/>
+      </w:pPr>
+      <w:r>
+        <w:rPr>
+          <w:sz w:val="21"/>
+          <w:szCs w:val="21"/>
+        </w:rPr>
+        <w:t xml:space="preserve">금고 옆, 찢어진 한서연의 진짜 계획서 조각을 직급별로 나눠 확인한다. 공식 5R 순서: Refuse(거절하기) → Reduce(줄이기) → Reuse(재사용하기) → Recycle(재활용하기) → Rot(썩히기).</w:t>
       </w:r>
     </w:p>
     <w:tbl>
@@ -7336,7 +7182,7 @@
                 <w:sz w:val="20"/>
                 <w:szCs w:val="20"/>
               </w:rPr>
-              <w:t xml:space="preserve">재사용</w:t>
+              <w:t xml:space="preserve">Reuse(재사용하기)</w:t>
             </w:r>
           </w:p>
         </w:tc>
@@ -7392,7 +7238,7 @@
                 <w:sz w:val="20"/>
                 <w:szCs w:val="20"/>
               </w:rPr>
-              <w:t xml:space="preserve">'낡거나 망가진 옷을 고쳐 입는다'는 어떤 실천?</w:t>
+              <w:t xml:space="preserve">'꼭 필요한 만큼만 구매한다'는 어떤 실천?</w:t>
             </w:r>
           </w:p>
         </w:tc>
@@ -7419,7 +7265,7 @@
                 <w:sz w:val="20"/>
                 <w:szCs w:val="20"/>
               </w:rPr>
-              <w:t xml:space="preserve">고쳐서 수명을 늘리는 행동입니다</w:t>
+              <w:t xml:space="preserve">소비량 자체를 줄이는 행동입니다</w:t>
             </w:r>
           </w:p>
         </w:tc>
@@ -7446,7 +7292,7 @@
                 <w:sz w:val="20"/>
                 <w:szCs w:val="20"/>
               </w:rPr>
-              <w:t xml:space="preserve">수선</w:t>
+              <w:t xml:space="preserve">Reduce(줄이기)</w:t>
             </w:r>
           </w:p>
         </w:tc>
@@ -7500,7 +7346,7 @@
                 <w:sz w:val="20"/>
                 <w:szCs w:val="20"/>
               </w:rPr>
-              <w:t xml:space="preserve">'위 방법이 불가능할 때 소재를 재가공한다'는 어떤 실천?</w:t>
+              <w:t xml:space="preserve">'천연 소재 자투리를 흙에 묻어 자연 분해시킨다'는 어떤 실천?</w:t>
             </w:r>
           </w:p>
         </w:tc>
@@ -7526,7 +7372,7 @@
                 <w:sz w:val="20"/>
                 <w:szCs w:val="20"/>
               </w:rPr>
-              <w:t xml:space="preserve">가장 마지막에 쓰는 수단입니다</w:t>
+              <w:t xml:space="preserve">가장 마지막, 자연으로 돌려보내는 방법입니다</w:t>
             </w:r>
           </w:p>
         </w:tc>
@@ -7552,7 +7398,7 @@
                 <w:sz w:val="20"/>
                 <w:szCs w:val="20"/>
               </w:rPr>
-              <w:t xml:space="preserve">재활용</w:t>
+              <w:t xml:space="preserve">Rot(썩히기)</w:t>
             </w:r>
           </w:p>
         </w:tc>
@@ -7608,7 +7454,7 @@
                 <w:sz w:val="20"/>
                 <w:szCs w:val="20"/>
               </w:rPr>
-              <w:t xml:space="preserve">'애초에 필요 없는 소비를 안 한다' + '꼭 필요한 만큼만 구매한다'는 각각 어떤 실천? + 종합 순서</w:t>
+              <w:t xml:space="preserve">'애초에 필요 없는 소비를 안 한다' + '소재를 재가공해서 다른 제품으로 만든다'는 각각 어떤 실천? + 종합 순서</w:t>
             </w:r>
           </w:p>
         </w:tc>
@@ -7635,7 +7481,7 @@
                 <w:sz w:val="20"/>
                 <w:szCs w:val="20"/>
               </w:rPr>
-              <w:t xml:space="preserve">예방적으로 가장 먼저 할 수 있는 두 가지 행동입니다</w:t>
+              <w:t xml:space="preserve">예방적으로 가장 먼저 할 수 있는 행동과, 재가공하는 행동을 구분해보세요</w:t>
             </w:r>
           </w:p>
         </w:tc>
@@ -7662,7 +7508,7 @@
                 <w:sz w:val="20"/>
                 <w:szCs w:val="20"/>
               </w:rPr>
-              <w:t xml:space="preserve">거절하기 / 줄이기 / 종합정답: 거절하기→줄이기→재사용→수선→재활용</w:t>
+              <w:t xml:space="preserve">Refuse(거절하기) / Recycle(재활용하기) / 종합정답: Refuse→Reduce→Reuse→Recycle→Rot</w:t>
             </w:r>
           </w:p>
         </w:tc>
@@ -7677,7 +7523,7 @@
           <w:sz w:val="21"/>
           <w:szCs w:val="21"/>
         </w:rPr>
-        <w:t xml:space="preserve">해설: [9기가02-06] 해설의 3R(Reduce·Reuse·Recycle)을 확장한 5R 우선순위로, 소비를 만들지 않는 예방적 행동이 먼저이고 재활용이 마지막 수단이라는 순서를 담고 있다. 부장은 자신이 맡은 두 조각(거절하기·줄이기)에 나머지 세 사람의 결과(재사용·수선·재활용)를 합쳐 전체 순서를 완성한다.</w:t>
+        <w:t xml:space="preserve">해설: Recycle(재활용)과 Rot(썩히기)을 헷갈리기 쉬운데, 재활용은 소재를 다른 제품으로 재가공하는 것이고 썩히기는 천연 소재를 자연 분해시키는 것으로 서로 다른 개념이다. 부장은 자신이 맡은 두 조각에 나머지 세 사람의 결과를 합쳐 전체 순서를 완성한다.</w:t>
       </w:r>
     </w:p>
     <w:p>
@@ -7686,7 +7532,22 @@
         <w:spacing w:after="150" w:before="300"/>
       </w:pPr>
       <w:r>
-        <w:t xml:space="preserve">5-3. 환경영향점수 비교 — 두 계획서의 차이</w:t>
+        <w:t xml:space="preserve">6-3. 청약철회 트릭 (양념 — 소비자 개념)</w:t>
+      </w:r>
+    </w:p>
+    <w:p>
+      <w:pPr>
+        <w:spacing w:after="160" w:line="300"/>
+      </w:pPr>
+      <w:r>
+        <w:rPr>
+          <w:i/>
+          <w:iCs/>
+          <w:color w:val="555555"/>
+          <w:sz w:val="21"/>
+          <w:szCs w:val="21"/>
+        </w:rPr>
+        <w:t xml:space="preserve">복원된 계획서를 조심스레 넘기던 중, 페이지 사이에 끼워져 있던 낯선 종이 한 장이 팔랑거리며 바닥에 떨어졌다. 온라인 쇼핑몰 영수증이었다 — 강태오가 몰래 값싼 원단을 대량으로 주문한 기록이었다.</w:t>
       </w:r>
     </w:p>
     <w:p>
@@ -7698,7 +7559,236 @@
           <w:sz w:val="21"/>
           <w:szCs w:val="21"/>
         </w:rPr>
-        <w:t xml:space="preserve">강태오의 원래 계획(다섯 벌 모두 새 옷 구매)과 한서연의 복원 계획(일부 재사용·수선)을 항목별로 나눠 계산한다.</w:t>
+        <w:t xml:space="preserve">계획서 사이에서 강태오가 온라인으로 몰래 저가 원단을 주문한 영수증을 발견한다.</w:t>
+      </w:r>
+    </w:p>
+    <w:tbl>
+      <w:tblPr>
+        <w:tblW w:type="dxa" w:w="9026"/>
+        <w:tblBorders>
+          <w:top w:val="single" w:color="auto" w:sz="4"/>
+          <w:left w:val="single" w:color="auto" w:sz="4"/>
+          <w:bottom w:val="single" w:color="auto" w:sz="4"/>
+          <w:right w:val="single" w:color="auto" w:sz="4"/>
+          <w:insideH w:val="single" w:color="auto" w:sz="4"/>
+          <w:insideV w:val="single" w:color="auto" w:sz="4"/>
+        </w:tblBorders>
+      </w:tblPr>
+      <w:tblGrid>
+        <w:gridCol w:w="3200"/>
+        <w:gridCol w:w="1400"/>
+        <w:gridCol w:w="4426"/>
+      </w:tblGrid>
+      <w:tr>
+        <w:tc>
+          <w:tcPr>
+            <w:tcW w:type="dxa" w:w="3200"/>
+            <w:shd w:fill="D9E2D0" w:val="clear"/>
+            <w:tcMar>
+              <w:top w:type="dxa" w:w="100"/>
+              <w:left w:type="dxa" w:w="120"/>
+              <w:bottom w:type="dxa" w:w="100"/>
+              <w:right w:type="dxa" w:w="120"/>
+            </w:tcMar>
+            <w:vAlign w:val="center"/>
+          </w:tcPr>
+          <w:p>
+            <w:pPr>
+              <w:jc w:val="left"/>
+            </w:pPr>
+            <w:r>
+              <w:rPr>
+                <w:b/>
+                <w:bCs/>
+                <w:sz w:val="20"/>
+                <w:szCs w:val="20"/>
+              </w:rPr>
+              <w:t xml:space="preserve">문제</w:t>
+            </w:r>
+          </w:p>
+        </w:tc>
+        <w:tc>
+          <w:tcPr>
+            <w:tcW w:type="dxa" w:w="1400"/>
+            <w:shd w:fill="D9E2D0" w:val="clear"/>
+            <w:tcMar>
+              <w:top w:type="dxa" w:w="100"/>
+              <w:left w:type="dxa" w:w="120"/>
+              <w:bottom w:type="dxa" w:w="100"/>
+              <w:right w:type="dxa" w:w="120"/>
+            </w:tcMar>
+            <w:vAlign w:val="center"/>
+          </w:tcPr>
+          <w:p>
+            <w:pPr>
+              <w:jc w:val="left"/>
+            </w:pPr>
+            <w:r>
+              <w:rPr>
+                <w:b/>
+                <w:bCs/>
+                <w:sz w:val="20"/>
+                <w:szCs w:val="20"/>
+              </w:rPr>
+              <w:t xml:space="preserve">정답</w:t>
+            </w:r>
+          </w:p>
+        </w:tc>
+        <w:tc>
+          <w:tcPr>
+            <w:tcW w:type="dxa" w:w="4426"/>
+            <w:shd w:fill="D9E2D0" w:val="clear"/>
+            <w:tcMar>
+              <w:top w:type="dxa" w:w="100"/>
+              <w:left w:type="dxa" w:w="120"/>
+              <w:bottom w:type="dxa" w:w="100"/>
+              <w:right w:type="dxa" w:w="120"/>
+            </w:tcMar>
+            <w:vAlign w:val="center"/>
+          </w:tcPr>
+          <w:p>
+            <w:pPr>
+              <w:jc w:val="left"/>
+            </w:pPr>
+            <w:r>
+              <w:rPr>
+                <w:b/>
+                <w:bCs/>
+                <w:sz w:val="20"/>
+                <w:szCs w:val="20"/>
+              </w:rPr>
+              <w:t xml:space="preserve">해설</w:t>
+            </w:r>
+          </w:p>
+        </w:tc>
+      </w:tr>
+      <w:tr>
+        <w:tc>
+          <w:tcPr>
+            <w:tcW w:type="dxa" w:w="3200"/>
+            <w:tcMar>
+              <w:top w:type="dxa" w:w="100"/>
+              <w:left w:type="dxa" w:w="120"/>
+              <w:bottom w:type="dxa" w:w="100"/>
+              <w:right w:type="dxa" w:w="120"/>
+            </w:tcMar>
+            <w:vAlign w:val="center"/>
+          </w:tcPr>
+          <w:p>
+            <w:pPr>
+              <w:jc w:val="left"/>
+            </w:pPr>
+            <w:r>
+              <w:rPr>
+                <w:b w:val="false"/>
+                <w:bCs w:val="false"/>
+                <w:sz w:val="20"/>
+                <w:szCs w:val="20"/>
+              </w:rPr>
+              <w:t xml:space="preserve">강태오는 이 원단을 SNS 쇼핑몰(전자상거래)로 구매했다. 청약철회(반품 요청)가 가능한 기간은?</w:t>
+            </w:r>
+          </w:p>
+        </w:tc>
+        <w:tc>
+          <w:tcPr>
+            <w:tcW w:type="dxa" w:w="1400"/>
+            <w:tcMar>
+              <w:top w:type="dxa" w:w="100"/>
+              <w:left w:type="dxa" w:w="120"/>
+              <w:bottom w:type="dxa" w:w="100"/>
+              <w:right w:type="dxa" w:w="120"/>
+            </w:tcMar>
+            <w:vAlign w:val="center"/>
+          </w:tcPr>
+          <w:p>
+            <w:pPr>
+              <w:jc w:val="left"/>
+            </w:pPr>
+            <w:r>
+              <w:rPr>
+                <w:b w:val="false"/>
+                <w:bCs w:val="false"/>
+                <w:sz w:val="20"/>
+                <w:szCs w:val="20"/>
+              </w:rPr>
+              <w:t xml:space="preserve">7일 이내</w:t>
+            </w:r>
+          </w:p>
+        </w:tc>
+        <w:tc>
+          <w:tcPr>
+            <w:tcW w:type="dxa" w:w="4426"/>
+            <w:tcMar>
+              <w:top w:type="dxa" w:w="100"/>
+              <w:left w:type="dxa" w:w="120"/>
+              <w:bottom w:type="dxa" w:w="100"/>
+              <w:right w:type="dxa" w:w="120"/>
+            </w:tcMar>
+            <w:vAlign w:val="center"/>
+          </w:tcPr>
+          <w:p>
+            <w:pPr>
+              <w:jc w:val="left"/>
+            </w:pPr>
+            <w:r>
+              <w:rPr>
+                <w:b w:val="false"/>
+                <w:bCs w:val="false"/>
+                <w:sz w:val="20"/>
+                <w:szCs w:val="20"/>
+              </w:rPr>
+              <w:t xml:space="preserve">전자상거래·할부거래는 7일 이내, 방문판매·전화권유판매·다단계판매는 14일 이내로 청약철회 기간이 다르다. '반품은 무조건 14일'이라고 생각하면 틀리기 쉬운 함정 문제다.</w:t>
+            </w:r>
+          </w:p>
+        </w:tc>
+      </w:tr>
+    </w:tbl>
+    <w:p>
+      <w:pPr>
+        <w:spacing w:after="160" w:line="300"/>
+      </w:pPr>
+      <w:r>
+        <w:rPr>
+          <w:i/>
+          <w:iCs/>
+          <w:color w:val="555555"/>
+          <w:sz w:val="21"/>
+          <w:szCs w:val="21"/>
+        </w:rPr>
+        <w:t xml:space="preserve">이 문항은 [9기가02-13] 소비자 권리와 연결되는 보너스 문항으로, 단원의 중심 내용(디자인·지속가능성)에 곁들이는 요소다.</w:t>
+      </w:r>
+    </w:p>
+    <w:p>
+      <w:pPr>
+        <w:pStyle w:val="Heading2"/>
+        <w:spacing w:after="150" w:before="300"/>
+      </w:pPr>
+      <w:r>
+        <w:t xml:space="preserve">6-4. 환경영향점수 비교 — 두 계획서의 차이</w:t>
+      </w:r>
+    </w:p>
+    <w:p>
+      <w:pPr>
+        <w:spacing w:after="160" w:line="300"/>
+      </w:pPr>
+      <w:r>
+        <w:rPr>
+          <w:sz w:val="21"/>
+          <w:szCs w:val="21"/>
+        </w:rPr>
+        <w:t xml:space="preserve">영수증 뒷면을 뒤집어보니 놀랍게도 표가 하나 그려져 있었다. 강태오가 스스로 비교해 본 흔적 같았다 — 자기 계획대로 했을 때와, 한서연의 방식대로 했을 때 비용이 얼마나 차이 나는지 계산해본 표였다. 그는 이미 알고 있었던 것이다, 자신의 방식이 얼마나 환경에 해로운지.</w:t>
+      </w:r>
+    </w:p>
+    <w:p>
+      <w:pPr>
+        <w:spacing w:after="160" w:line="300"/>
+      </w:pPr>
+      <w:r>
+        <w:rPr>
+          <w:sz w:val="21"/>
+          <w:szCs w:val="21"/>
+        </w:rPr>
+        <w:t xml:space="preserve">강태오의 원래 계획(다섯 벌 모두 새 옷 구매)과 한서연의 복원 계획(일부 재사용·재활용)을 항목별로 나눠 계산한다.</w:t>
       </w:r>
     </w:p>
     <w:tbl>
@@ -8094,7 +8184,7 @@
                 <w:sz w:val="20"/>
                 <w:szCs w:val="20"/>
               </w:rPr>
-              <w:t xml:space="preserve">수선(2점)</w:t>
+              <w:t xml:space="preserve">재활용(2점)</w:t>
             </w:r>
           </w:p>
         </w:tc>
@@ -8434,7 +8524,7 @@
                 <w:sz w:val="20"/>
                 <w:szCs w:val="20"/>
               </w:rPr>
-              <w:t xml:space="preserve">다섯 항목 각각 다른 선택을 반영해 합산하는 문제로, 재사용·수선처럼 순환을 실천하는 선택이 쌓일수록 절약되는 점수가 커진다는 것을 계산으로 확인한다.</w:t>
+              <w:t xml:space="preserve">다섯 항목 각각 다른 선택을 반영해 합산하는 문제로, 재사용·재활용처럼 순환을 실천하는 선택이 쌓일수록 절약되는 점수가 커진다는 것을 계산으로 확인한다.</w:t>
             </w:r>
           </w:p>
         </w:tc>
@@ -8446,7 +8536,19 @@
         <w:spacing w:after="150" w:before="300"/>
       </w:pPr>
       <w:r>
-        <w:t xml:space="preserve">5-4. 실천적 추론 — 마지막 회유</w:t>
+        <w:t xml:space="preserve">6-5. 실천적 추론 — 마지막 회유</w:t>
+      </w:r>
+    </w:p>
+    <w:p>
+      <w:pPr>
+        <w:spacing w:after="160" w:line="300"/>
+      </w:pPr>
+      <w:r>
+        <w:rPr>
+          <w:sz w:val="21"/>
+          <w:szCs w:val="21"/>
+        </w:rPr>
+        <w:t xml:space="preserve">계산을 마치자 서재 마지막 서랍이 열렸다. 그 안에는 강태오가 직접 쓴 것으로 보이는 마지막 메모 한 장이 있었다. 지금까지와는 달리, 명령이 아니라 부탁에 가까운 어조였다.</w:t>
       </w:r>
     </w:p>
     <w:tbl>
@@ -8690,6 +8792,21 @@
       </w:r>
     </w:p>
     <w:p>
+      <w:pPr>
+        <w:spacing w:after="160" w:line="300"/>
+      </w:pPr>
+      <w:r>
+        <w:rPr>
+          <w:i/>
+          <w:iCs/>
+          <w:color w:val="555555"/>
+          <w:sz w:val="21"/>
+          <w:szCs w:val="21"/>
+        </w:rPr>
+        <w:t xml:space="preserve">세 번째 원단 조각까지 손에 쥐자, 서재 벽 스크린에 지금까지 모은 조각들이 하나로 합쳐지며 완성된 도안이 떠올랐다. 스피커에서 한서연의 목소리가 흘러나왔다. '여러분이라면 해낼 줄 알았어요. 이제 이 도안대로, 진짜 컬렉션을 세상에 보여주세요.' 팀은 원단 조각 세 장을 들고 런웨이 제출존으로 향한다.</w:t>
+      </w:r>
+    </w:p>
+    <w:p>
       <w:r>
         <w:br w:type="page"/>
       </w:r>
@@ -8700,7 +8817,7 @@
         <w:spacing w:after="200" w:before="400"/>
       </w:pPr>
       <w:r>
-        <w:t xml:space="preserve">6. 마무리 — 조원별 개인 디자인 제출 및 활동 소감</w:t>
+        <w:t xml:space="preserve">7. 마무리 — 조원별 개인 디자인 제출 및 활동 소감</w:t>
       </w:r>
     </w:p>
     <w:p>
@@ -8712,7 +8829,7 @@
           <w:sz w:val="21"/>
           <w:szCs w:val="21"/>
         </w:rPr>
-        <w:t xml:space="preserve">팀 제출이 끝나면, 각자 자신의 직급으로 로그인된 화면에서 개인 디자인과 소감을 남긴다.</w:t>
+        <w:t xml:space="preserve">런웨이 제출존에서 발표를 마치자 화면에 마지막 메시지가 떴다. '여러분 각자도 자신만의 컬렉션을 가지고 있어요. 이제 여러분 차례입니다.' — 팀의 임무는 끝났지만, 이제부터는 각자 자신을 위한 옷차림을 완성할 시간이다.</w:t>
       </w:r>
     </w:p>
     <w:p>
@@ -8721,7 +8838,82 @@
         <w:spacing w:after="150" w:before="300"/>
       </w:pPr>
       <w:r>
-        <w:t xml:space="preserve">6-1. 나에게 어울리는 디자인 제출 (개인)</w:t>
+        <w:t xml:space="preserve">7-1. 나에게 어울리는 옷차림 그리기 (개인)</w:t>
+      </w:r>
+    </w:p>
+    <w:p>
+      <w:pPr>
+        <w:spacing w:after="160" w:line="300"/>
+      </w:pPr>
+      <w:r>
+        <w:rPr>
+          <w:sz w:val="21"/>
+          <w:szCs w:val="21"/>
+        </w:rPr>
+        <w:t xml:space="preserve">교과서 77쪽 실습 '자신에게 어울리는 옷차림 그리기' 활동을 그대로 웹앱에 반영한다.</w:t>
+      </w:r>
+    </w:p>
+    <w:p>
+      <w:pPr>
+        <w:pStyle w:val="ListParagraph"/>
+        <w:numPr>
+          <w:ilvl w:val="0"/>
+          <w:numId w:val="1"/>
+        </w:numPr>
+        <w:spacing w:after="80" w:line="276"/>
+      </w:pPr>
+      <w:r>
+        <w:rPr>
+          <w:sz w:val="21"/>
+          <w:szCs w:val="21"/>
+        </w:rPr>
+        <w:t xml:space="preserve">종이에 직접 그리거나, 오토드로우(AutoDraw) 등 그리기 앱을 이용해 그린 뒤 사진을 찍어 웹앱에 업로드한다 (Firebase Storage에 이미지 저장)</w:t>
+      </w:r>
+    </w:p>
+    <w:p>
+      <w:pPr>
+        <w:pStyle w:val="ListParagraph"/>
+        <w:numPr>
+          <w:ilvl w:val="0"/>
+          <w:numId w:val="1"/>
+        </w:numPr>
+        <w:spacing w:after="80" w:line="276"/>
+      </w:pPr>
+      <w:r>
+        <w:rPr>
+          <w:sz w:val="21"/>
+          <w:szCs w:val="21"/>
+        </w:rPr>
+        <w:t xml:space="preserve">상·하의뿐 아니라 신발, 모자, 가방 등 액세서리까지 포함해서 그린다</w:t>
+      </w:r>
+    </w:p>
+    <w:p>
+      <w:pPr>
+        <w:pStyle w:val="ListParagraph"/>
+        <w:numPr>
+          <w:ilvl w:val="0"/>
+          <w:numId w:val="1"/>
+        </w:numPr>
+        <w:spacing w:after="80" w:line="276"/>
+      </w:pPr>
+      <w:r>
+        <w:rPr>
+          <w:sz w:val="21"/>
+          <w:szCs w:val="21"/>
+        </w:rPr>
+        <w:t xml:space="preserve">무늬는 그리기 도구로 상세하게 표현한다</w:t>
+      </w:r>
+    </w:p>
+    <w:p>
+      <w:pPr>
+        <w:spacing w:after="160" w:line="300"/>
+      </w:pPr>
+      <w:r>
+        <w:rPr>
+          <w:sz w:val="21"/>
+          <w:szCs w:val="21"/>
+        </w:rPr>
+        <w:t xml:space="preserve">그림과 함께 아래 '디자인 노트'를 작성해 제출한다.</w:t>
       </w:r>
     </w:p>
     <w:tbl>
@@ -8845,7 +9037,7 @@
                 <w:sz w:val="20"/>
                 <w:szCs w:val="20"/>
               </w:rPr>
-              <w:t xml:space="preserve">선·색·재질·무늬를 각각 선택</w:t>
+              <w:t xml:space="preserve">선·색·재질·무늬를 각각 선택 (그림 내용과 일치하도록)</w:t>
             </w:r>
           </w:p>
         </w:tc>
@@ -9011,7 +9203,7 @@
                 <w:sz w:val="20"/>
                 <w:szCs w:val="20"/>
               </w:rPr>
-              <w:t xml:space="preserve">5R 중 실천할 수 있는 것 1가지 선택</w:t>
+              <w:t xml:space="preserve">5R(Refuse~Rot) 중 실천할 수 있는 것 1가지 선택</w:t>
             </w:r>
           </w:p>
         </w:tc>
@@ -9026,7 +9218,7 @@
           <w:sz w:val="21"/>
           <w:szCs w:val="21"/>
         </w:rPr>
-        <w:t xml:space="preserve">채점 기준: [9기가01-04], [9기가02-06]을 개인이 직접 적용했는지 평가. 정답이 정해진 문항이 아니다.</w:t>
+        <w:t xml:space="preserve">채점 기준: [9기가01-04], [9기가02-06]을 개인이 직접 적용했는지 평가. 그림의 완성도가 아니라, 그림과 디자인 노트의 내용이 서로 일치하는지, 자기 자신에 대한 근거가 담겨 있는지를 본다. 정답이 정해진 문항이 아니다.</w:t>
       </w:r>
     </w:p>
     <w:p>
@@ -9035,7 +9227,111 @@
         <w:spacing w:after="150" w:before="300"/>
       </w:pPr>
       <w:r>
-        <w:t xml:space="preserve">6-2. 활동 소감 제출 (개인)</w:t>
+        <w:t xml:space="preserve">7-1-보조. AI 그림 분석 (선택 기능)</w:t>
+      </w:r>
+    </w:p>
+    <w:p>
+      <w:pPr>
+        <w:spacing w:after="160" w:line="300"/>
+      </w:pPr>
+      <w:r>
+        <w:rPr>
+          <w:sz w:val="21"/>
+          <w:szCs w:val="21"/>
+        </w:rPr>
+        <w:t xml:space="preserve">업로드된 그림을 Claude API(비전)로 분석해, 학생이 직접 고른 디자인 노트 항목과 자동으로 비교해준다.</w:t>
+      </w:r>
+    </w:p>
+    <w:p>
+      <w:pPr>
+        <w:pStyle w:val="ListParagraph"/>
+        <w:numPr>
+          <w:ilvl w:val="0"/>
+          <w:numId w:val="1"/>
+        </w:numPr>
+        <w:spacing w:after="80" w:line="276"/>
+      </w:pPr>
+      <w:r>
+        <w:rPr>
+          <w:sz w:val="21"/>
+          <w:szCs w:val="21"/>
+        </w:rPr>
+        <w:t xml:space="preserve">① 그림 업로드 직후, 이미지가 Firebase Functions를 거쳐 Claude API로 전송된다</w:t>
+      </w:r>
+    </w:p>
+    <w:p>
+      <w:pPr>
+        <w:pStyle w:val="ListParagraph"/>
+        <w:numPr>
+          <w:ilvl w:val="0"/>
+          <w:numId w:val="1"/>
+        </w:numPr>
+        <w:spacing w:after="80" w:line="276"/>
+      </w:pPr>
+      <w:r>
+        <w:rPr>
+          <w:sz w:val="21"/>
+          <w:szCs w:val="21"/>
+        </w:rPr>
+        <w:t xml:space="preserve">② AI에게 '이 그림에서 선(직선/곡선/사선), 색 계열(난색/한색), 무늬(큰·작은·기하학적), 액세서리 포함 여부를 읽어달라'고 요청한다</w:t>
+      </w:r>
+    </w:p>
+    <w:p>
+      <w:pPr>
+        <w:pStyle w:val="ListParagraph"/>
+        <w:numPr>
+          <w:ilvl w:val="0"/>
+          <w:numId w:val="1"/>
+        </w:numPr>
+        <w:spacing w:after="80" w:line="276"/>
+      </w:pPr>
+      <w:r>
+        <w:rPr>
+          <w:sz w:val="21"/>
+          <w:szCs w:val="21"/>
+        </w:rPr>
+        <w:t xml:space="preserve">③ AI가 읽어낸 결과와 학생이 디자인 노트에서 선택한 항목을 비교한다</w:t>
+      </w:r>
+    </w:p>
+    <w:p>
+      <w:pPr>
+        <w:pStyle w:val="ListParagraph"/>
+        <w:numPr>
+          <w:ilvl w:val="0"/>
+          <w:numId w:val="1"/>
+        </w:numPr>
+        <w:spacing w:after="80" w:line="276"/>
+      </w:pPr>
+      <w:r>
+        <w:rPr>
+          <w:sz w:val="21"/>
+          <w:szCs w:val="21"/>
+        </w:rPr>
+        <w:t xml:space="preserve">④ 일치하면 '그림과 노트가 잘 맞아요!' 같은 격려 피드백을, 다르면 '그림에는 세로선이 보이는데 노트에는 가로선을 고르셨네요. 다시 확인해볼까요?'처럼 스스로 점검하도록 유도하는 피드백을 보여준다</w:t>
+      </w:r>
+    </w:p>
+    <w:p>
+      <w:pPr>
+        <w:spacing w:after="160" w:line="300"/>
+      </w:pPr>
+      <w:r>
+        <w:rPr>
+          <w:i/>
+          <w:iCs/>
+          <w:color w:val="555555"/>
+          <w:sz w:val="21"/>
+          <w:szCs w:val="21"/>
+        </w:rPr>
+        <w:t xml:space="preserve">주의: 그림 실력을 평가하는 기능이 아니라 '그림과 설명의 일치 여부'만 참고용으로 확인하는 기능이다. 화면에 'AI의 분석은 참고용이며, 최종 판단은 학생 자신의 몫입니다'라는 안내 문구를 반드시 표시한다.</w:t>
+      </w:r>
+    </w:p>
+    <w:p>
+      <w:pPr>
+        <w:pStyle w:val="Heading2"/>
+        <w:spacing w:after="150" w:before="300"/>
+      </w:pPr>
+      <w:r>
+        <w:t xml:space="preserve">7-2. 활동 소감 제출 (개인)</w:t>
       </w:r>
     </w:p>
     <w:tbl>
@@ -9244,7 +9540,7 @@
         <w:spacing w:after="200" w:before="400"/>
       </w:pPr>
       <w:r>
-        <w:t xml:space="preserve">7. 학급 공용 환경 회복 게이지</w:t>
+        <w:t xml:space="preserve">8. 학급 공용 환경 회복 게이지</w:t>
       </w:r>
     </w:p>
     <w:p>
@@ -9524,7 +9820,7 @@
         <w:spacing w:after="200" w:before="400"/>
       </w:pPr>
       <w:r>
-        <w:t xml:space="preserve">8. 점수 체계</w:t>
+        <w:t xml:space="preserve">9. 점수 체계</w:t>
       </w:r>
     </w:p>
     <w:tbl>
@@ -9819,6 +10115,60 @@
           </w:p>
         </w:tc>
       </w:tr>
+      <w:tr>
+        <w:tc>
+          <w:tcPr>
+            <w:tcW w:type="dxa" w:w="5200"/>
+            <w:tcMar>
+              <w:top w:type="dxa" w:w="100"/>
+              <w:left w:type="dxa" w:w="120"/>
+              <w:bottom w:type="dxa" w:w="100"/>
+              <w:right w:type="dxa" w:w="120"/>
+            </w:tcMar>
+            <w:vAlign w:val="center"/>
+          </w:tcPr>
+          <w:p>
+            <w:pPr>
+              <w:jc w:val="left"/>
+            </w:pPr>
+            <w:r>
+              <w:rPr>
+                <w:b w:val="false"/>
+                <w:bCs w:val="false"/>
+                <w:sz w:val="20"/>
+                <w:szCs w:val="20"/>
+              </w:rPr>
+              <w:t xml:space="preserve">청약철회 트릭 문제 정답 (3단계, 보너스)</w:t>
+            </w:r>
+          </w:p>
+        </w:tc>
+        <w:tc>
+          <w:tcPr>
+            <w:tcW w:type="dxa" w:w="3826"/>
+            <w:tcMar>
+              <w:top w:type="dxa" w:w="100"/>
+              <w:left w:type="dxa" w:w="120"/>
+              <w:bottom w:type="dxa" w:w="100"/>
+              <w:right w:type="dxa" w:w="120"/>
+            </w:tcMar>
+            <w:vAlign w:val="center"/>
+          </w:tcPr>
+          <w:p>
+            <w:pPr>
+              <w:jc w:val="left"/>
+            </w:pPr>
+            <w:r>
+              <w:rPr>
+                <w:b w:val="false"/>
+                <w:bCs w:val="false"/>
+                <w:sz w:val="20"/>
+                <w:szCs w:val="20"/>
+              </w:rPr>
+              <w:t xml:space="preserve">+10점</w:t>
+            </w:r>
+          </w:p>
+        </w:tc>
+      </w:tr>
     </w:tbl>
     <w:p>
       <w:pPr>
@@ -9826,19 +10176,7 @@
         <w:spacing w:after="200" w:before="400"/>
       </w:pPr>
       <w:r>
-        <w:t xml:space="preserve">9. 데이터 구조 (Firebase Firestore)</w:t>
-      </w:r>
-    </w:p>
-    <w:p>
-      <w:pPr>
-        <w:spacing w:after="160" w:line="300"/>
-      </w:pPr>
-      <w:r>
-        <w:rPr>
-          <w:sz w:val="21"/>
-          <w:szCs w:val="21"/>
-        </w:rPr>
-        <w:t xml:space="preserve">구글 시트 대신 Firestore 컬렉션으로 수집한다. 부서(팀)를 최상위 문서로 두고, 그 아래 서브컬렉션으로 직급별 제출·로그를 저장하는 구조를 권장한다.</w:t>
+        <w:t xml:space="preserve">10. 데이터 구조 (Firebase Firestore)</w:t>
       </w:r>
     </w:p>
     <w:tbl>
@@ -10099,7 +10437,7 @@
                 <w:sz w:val="20"/>
                 <w:szCs w:val="20"/>
               </w:rPr>
-              <w:t xml:space="preserve">직급 중복 선택 방지 — 문서가 이미 있으면 해당 직급 버튼 비활성화</w:t>
+              <w:t xml:space="preserve">직급 중복 선택 방지</w:t>
             </w:r>
           </w:p>
         </w:tc>
@@ -10262,7 +10600,7 @@
                 <w:sz w:val="20"/>
                 <w:szCs w:val="20"/>
               </w:rPr>
-              <w:t xml:space="preserve">전체 부서 공용 문항 마스터 데이터(읽기 전용)</w:t>
+              <w:t xml:space="preserve">전체 부서 공용 문항 마스터(읽기 전용)</w:t>
             </w:r>
           </w:p>
         </w:tc>
@@ -10316,7 +10654,7 @@
                 <w:sz w:val="20"/>
                 <w:szCs w:val="20"/>
               </w:rPr>
-              <w:t xml:space="preserve">역할군(인턴사원/차장부장) · 의견 · 최종합의</w:t>
+              <w:t xml:space="preserve">역할군 · 의견 · 최종합의</w:t>
             </w:r>
           </w:p>
         </w:tc>
@@ -10479,7 +10817,7 @@
                 <w:sz w:val="20"/>
                 <w:szCs w:val="20"/>
               </w:rPr>
-              <w:t xml:space="preserve">디자인요소 · 선택이유 · TPO · 지속가능성요소</w:t>
+              <w:t xml:space="preserve">imageUrl · 디자인요소 · 선택이유 · TPO · 지속가능성요소 · aiAnalysis(AI가 읽은 요소·일치여부·피드백)</w:t>
             </w:r>
           </w:p>
         </w:tc>
@@ -10505,7 +10843,7 @@
                 <w:sz w:val="20"/>
                 <w:szCs w:val="20"/>
               </w:rPr>
-              <w:t xml:space="preserve">개인 디자인 제출</w:t>
+              <w:t xml:space="preserve">개인 디자인 그림(업로드 이미지) + 디자인 노트 + AI 분석 결과</w:t>
             </w:r>
           </w:p>
         </w:tc>
@@ -10600,13 +10938,10 @@
       </w:pPr>
       <w:r>
         <w:rPr>
-          <w:i/>
-          <w:iCs/>
-          <w:color w:val="555555"/>
           <w:sz w:val="21"/>
           <w:szCs w:val="21"/>
         </w:rPr>
-        <w:t xml:space="preserve">실시간 동기화: 교사용 대시보드는 onSnapshot()으로 departments 컬렉션 전체를 구독해 부서별 진행 트랙과 envScore 합계를 실시간으로 갱신한다 (Sheets 폴링 방식보다 지연이 적다). roles 서브컬렉션에 대한 쓰기는 문서가 이미 존재하면 트랜잭션으로 거부해 직급 중복 선택을 막는다.</w:t>
+        <w:t xml:space="preserve">직급 중복 방지는 roles/{직급} 문서 생성을 트랜잭션(runTransaction)으로 처리해, 이미 문서가 있으면 쓰기를 거부하는 방식으로 구현한다. 교사 대시보드는 onSnapshot()으로 departments 컬렉션 전체를 구독해 실시간 갱신한다.</w:t>
       </w:r>
     </w:p>
     <w:p>
@@ -10615,7 +10950,7 @@
         <w:spacing w:after="200" w:before="400"/>
       </w:pPr>
       <w:r>
-        <w:t xml:space="preserve">10. 화면 구현 메모</w:t>
+        <w:t xml:space="preserve">11. 화면 구현 메모</w:t>
       </w:r>
     </w:p>
     <w:p>
@@ -10666,7 +11001,7 @@
           <w:sz w:val="21"/>
           <w:szCs w:val="21"/>
         </w:rPr>
-        <w:t xml:space="preserve">각 단계 화면은 로그인한 직급에 따라 자동으로 해당 난이도 문제만 표시 (같은 부서 링크라도 직급별로 다른 문제 렌더링)</w:t>
+        <w:t xml:space="preserve">각 단계 화면은 로그인한 직급에 따라 자동으로 해당 난이도 문제만 표시</w:t>
       </w:r>
     </w:p>
     <w:p>
@@ -10700,7 +11035,7 @@
           <w:sz w:val="21"/>
           <w:szCs w:val="21"/>
         </w:rPr>
-        <w:t xml:space="preserve">기기 1대를 돌려쓰는 경우, 화면 상단에 '현재 로그인: OOO 직급'을 크게 표시해 역할 전환을 명확히 안내</w:t>
+        <w:t xml:space="preserve">1단계 4-1 트릭 문제는 정답 원단(B)과 함정 원단(A·C·D)의 차이를 한눈에 비교할 수 있는 카드 그리드 UI로 구현 권장 (선택 시 4속성이 동시에 하이라이트되도록)</w:t>
       </w:r>
     </w:p>
     <w:p>
@@ -10717,7 +11052,41 @@
           <w:sz w:val="21"/>
           <w:szCs w:val="21"/>
         </w:rPr>
-        <w:t xml:space="preserve">여러 기기를 쓰는 경우 부서 코드로 세션을 공유해 각자 자신의 직급 화면에 바로 접속 가능하도록 확장 가능</w:t>
+        <w:t xml:space="preserve">6-3 청약철회 트릭은 오답 시 '반품 규정을 다시 확인해보세요'라는 힌트만 주고 정답을 바로 알려주지 않아 함정에서 스스로 빠져나오게 유도</w:t>
+      </w:r>
+    </w:p>
+    <w:p>
+      <w:pPr>
+        <w:pStyle w:val="ListParagraph"/>
+        <w:numPr>
+          <w:ilvl w:val="0"/>
+          <w:numId w:val="1"/>
+        </w:numPr>
+        <w:spacing w:after="80" w:line="276"/>
+      </w:pPr>
+      <w:r>
+        <w:rPr>
+          <w:sz w:val="21"/>
+          <w:szCs w:val="21"/>
+        </w:rPr>
+        <w:t xml:space="preserve">7-1 그림 업로드: 파일 입력(카메라 촬영 또는 갤러리 선택) → Firebase Storage 업로드 → 다운로드 URL을 personalDesigns 문서에 저장, 미리보기 화면에서 업로드 이미지와 디자인 노트를 함께 표시</w:t>
+      </w:r>
+    </w:p>
+    <w:p>
+      <w:pPr>
+        <w:pStyle w:val="ListParagraph"/>
+        <w:numPr>
+          <w:ilvl w:val="0"/>
+          <w:numId w:val="1"/>
+        </w:numPr>
+        <w:spacing w:after="80" w:line="276"/>
+      </w:pPr>
+      <w:r>
+        <w:rPr>
+          <w:sz w:val="21"/>
+          <w:szCs w:val="21"/>
+        </w:rPr>
+        <w:t xml:space="preserve">7-1 AI 분석: Claude API 키는 클라이언트에 절대 노출하지 않는다. Firebase Functions에 이미지 URL을 전달하면, 그 함수가 서버 측에서 Claude API를 호출하고 분석 결과(JSON)만 클라이언트로 반환하는 구조로 구현</w:t>
       </w:r>
     </w:p>
     <w:sectPr>

</xml_diff>